<commit_message>
Update graduate tracer features, security, and user interface
</commit_message>
<xml_diff>
--- a/public/templates/gts_template.docx
+++ b/public/templates/gts_template.docx
@@ -1,6 +1,6 @@
 
 <file path=word/document.xml><?xml version="1.0" encoding="utf-8"?>
-<w:document xmlns:wpc="http://schemas.microsoft.com/office/word/2010/wordprocessingCanvas" xmlns:cx="http://schemas.microsoft.com/office/drawing/2014/chartex" xmlns:cx1="http://schemas.microsoft.com/office/drawing/2015/9/8/chartex" xmlns:cx2="http://schemas.microsoft.com/office/drawing/2015/10/21/chartex" xmlns:cx3="http://schemas.microsoft.com/office/drawing/2016/5/9/chartex" xmlns:cx4="http://schemas.microsoft.com/office/drawing/2016/5/10/chartex" xmlns:cx5="http://schemas.microsoft.com/office/drawing/2016/5/11/chartex" xmlns:cx6="http://schemas.microsoft.com/office/drawing/2016/5/12/chartex" xmlns:cx7="http://schemas.microsoft.com/office/drawing/2016/5/13/chartex" xmlns:cx8="http://schemas.microsoft.com/office/drawing/2016/5/14/chartex" xmlns:mc="http://schemas.openxmlformats.org/markup-compatibility/2006" xmlns:aink="http://schemas.microsoft.com/office/drawing/2016/ink" xmlns:am3d="http://schemas.microsoft.com/office/drawing/2017/model3d" xmlns:o="urn:schemas-microsoft-com:office:office" xmlns:oel="http://schemas.microsoft.com/office/2019/extlst" xmlns:r="http://schemas.openxmlformats.org/officeDocument/2006/relationships" xmlns:m="http://schemas.openxmlformats.org/officeDocument/2006/math" xmlns:v="urn:schemas-microsoft-com:vml" xmlns:wp14="http://schemas.microsoft.com/office/word/2010/wordprocessingDrawing" xmlns:wp="http://schemas.openxmlformats.org/drawingml/2006/wordprocessingDrawing" xmlns:w10="urn:schemas-microsoft-com:office:word" xmlns:w="http://schemas.openxmlformats.org/wordprocessingml/2006/main" xmlns:w14="http://schemas.microsoft.com/office/word/2010/wordml" xmlns:w15="http://schemas.microsoft.com/office/word/2012/wordml" xmlns:w16cex="http://schemas.microsoft.com/office/word/2018/wordml/cex" xmlns:w16cid="http://schemas.microsoft.com/office/word/2016/wordml/cid" xmlns:w16="http://schemas.microsoft.com/office/word/2018/wordml" xmlns:w16du="http://schemas.microsoft.com/office/word/2023/wordml/word16du" xmlns:w16sdtdh="http://schemas.microsoft.com/office/word/2020/wordml/sdtdatahash" xmlns:w16sdtfl="http://schemas.microsoft.com/office/word/2024/wordml/sdtformatlock" xmlns:w16se="http://schemas.microsoft.com/office/word/2015/wordml/symex" xmlns:wpg="http://schemas.microsoft.com/office/word/2010/wordprocessingGroup" xmlns:wpi="http://schemas.microsoft.com/office/word/2010/wordprocessingInk" xmlns:wne="http://schemas.microsoft.com/office/word/2006/wordml" xmlns:wps="http://schemas.microsoft.com/office/word/2010/wordprocessingShape" mc:Ignorable="w14 w15 w16se w16cid w16 w16cex w16sdtdh w16sdtfl w16du wp14">
+<w:document xmlns:wpc="http://schemas.microsoft.com/office/word/2010/wordprocessingCanvas" xmlns:cx="http://schemas.microsoft.com/office/drawing/2014/chartex" xmlns:cx1="http://schemas.microsoft.com/office/drawing/2015/9/8/chartex" xmlns:cx2="http://schemas.microsoft.com/office/drawing/2015/10/21/chartex" xmlns:cx3="http://schemas.microsoft.com/office/drawing/2016/5/9/chartex" xmlns:cx4="http://schemas.microsoft.com/office/drawing/2016/5/10/chartex" xmlns:cx5="http://schemas.microsoft.com/office/drawing/2016/5/11/chartex" xmlns:cx6="http://schemas.microsoft.com/office/drawing/2016/5/12/chartex" xmlns:cx7="http://schemas.microsoft.com/office/drawing/2016/5/13/chartex" xmlns:cx8="http://schemas.microsoft.com/office/drawing/2016/5/14/chartex" xmlns:mc="http://schemas.openxmlformats.org/markup-compatibility/2006" xmlns:aink="http://schemas.microsoft.com/office/drawing/2016/ink" xmlns:am3d="http://schemas.microsoft.com/office/drawing/2017/model3d" xmlns:o="urn:schemas-microsoft-com:office:office" xmlns:oel="http://schemas.microsoft.com/office/2019/extlst" xmlns:r="http://schemas.openxmlformats.org/officeDocument/2006/relationships" xmlns:m="http://schemas.openxmlformats.org/officeDocument/2006/math" xmlns:v="urn:schemas-microsoft-com:vml" xmlns:wp14="http://schemas.microsoft.com/office/word/2010/wordprocessingDrawing" xmlns:wp="http://schemas.openxmlformats.org/drawingml/2006/wordprocessingDrawing" xmlns:w10="urn:schemas-microsoft-com:office:word" xmlns:w="http://schemas.openxmlformats.org/wordprocessingml/2006/main" xmlns:w14="http://schemas.microsoft.com/office/word/2010/wordml" xmlns:w15="http://schemas.microsoft.com/office/word/2012/wordml" xmlns:w16cei="http://schemas.microsoft.com/office/word/2026/wordml/cei" xmlns:w16cex="http://schemas.microsoft.com/office/word/2018/wordml/cex" xmlns:w16cid="http://schemas.microsoft.com/office/word/2016/wordml/cid" xmlns:w16="http://schemas.microsoft.com/office/word/2018/wordml" xmlns:w16du="http://schemas.microsoft.com/office/word/2023/wordml/word16du" xmlns:w16sdtdh="http://schemas.microsoft.com/office/word/2020/wordml/sdtdatahash" xmlns:w16sdtfl="http://schemas.microsoft.com/office/word/2024/wordml/sdtformatlock" xmlns:w16se="http://schemas.microsoft.com/office/word/2015/wordml/symex" xmlns:wpg="http://schemas.microsoft.com/office/word/2010/wordprocessingGroup" xmlns:wpi="http://schemas.microsoft.com/office/word/2010/wordprocessingInk" xmlns:wne="http://schemas.microsoft.com/office/word/2006/wordml" xmlns:wps="http://schemas.microsoft.com/office/word/2010/wordprocessingShape" mc:Ignorable="w14 w15 w16se w16cid w16 w16cex w16sdtdh w16sdtfl w16du wp14">
   <w:body>
     <w:p>
       <w:pPr>
@@ -600,7 +600,7 @@
           <w:ilvl w:val="0"/>
           <w:numId w:val="5"/>
         </w:numPr>
-        <w:spacing w:line="480" w:lineRule="auto"/>
+        <w:spacing w:after="0" w:line="240" w:lineRule="auto"/>
         <w:rPr>
           <w:rFonts w:ascii="Arial" w:hAnsi="Arial" w:cs="Arial"/>
           <w:sz w:val="17"/>
@@ -633,6 +633,64 @@
           <w:szCs w:val="17"/>
         </w:rPr>
         <w:t>permanent_address</w:t>
+      </w:r>
+      <w:proofErr w:type="spellEnd"/>
+      <w:r>
+        <w:rPr>
+          <w:rFonts w:ascii="Arial" w:hAnsi="Arial" w:cs="Arial"/>
+          <w:sz w:val="17"/>
+          <w:szCs w:val="17"/>
+        </w:rPr>
+        <w:t>}</w:t>
+      </w:r>
+    </w:p>
+    <w:p>
+      <w:pPr>
+        <w:spacing w:after="0" w:line="240" w:lineRule="auto"/>
+        <w:ind w:left="360"/>
+        <w:rPr>
+          <w:rFonts w:ascii="Arial" w:hAnsi="Arial" w:cs="Arial"/>
+          <w:sz w:val="17"/>
+          <w:szCs w:val="17"/>
+        </w:rPr>
+      </w:pPr>
+    </w:p>
+    <w:p>
+      <w:pPr>
+        <w:spacing w:after="0" w:line="480" w:lineRule="auto"/>
+        <w:ind w:left="720"/>
+        <w:rPr>
+          <w:rFonts w:ascii="Arial" w:hAnsi="Arial" w:cs="Arial"/>
+          <w:sz w:val="17"/>
+          <w:szCs w:val="17"/>
+        </w:rPr>
+      </w:pPr>
+      <w:r>
+        <w:rPr>
+          <w:rFonts w:ascii="Arial" w:hAnsi="Arial" w:cs="Arial"/>
+          <w:b/>
+          <w:bCs/>
+          <w:sz w:val="17"/>
+          <w:szCs w:val="17"/>
+        </w:rPr>
+        <w:t>Current Address</w:t>
+      </w:r>
+      <w:r>
+        <w:rPr>
+          <w:rFonts w:ascii="Arial" w:hAnsi="Arial" w:cs="Arial"/>
+          <w:sz w:val="17"/>
+          <w:szCs w:val="17"/>
+        </w:rPr>
+        <w:t>: {</w:t>
+      </w:r>
+      <w:proofErr w:type="spellStart"/>
+      <w:r>
+        <w:rPr>
+          <w:rFonts w:ascii="Arial" w:hAnsi="Arial" w:cs="Arial"/>
+          <w:sz w:val="17"/>
+          <w:szCs w:val="17"/>
+        </w:rPr>
+        <w:t>current_address</w:t>
       </w:r>
       <w:proofErr w:type="spellEnd"/>
       <w:r>
@@ -1051,6 +1109,16 @@
           <w:sz w:val="17"/>
           <w:szCs w:val="17"/>
         </w:rPr>
+        <w:t xml:space="preserve">Location of </w:t>
+      </w:r>
+      <w:r>
+        <w:rPr>
+          <w:rFonts w:ascii="Arial" w:hAnsi="Arial" w:cs="Arial"/>
+          <w:b/>
+          <w:bCs/>
+          <w:sz w:val="17"/>
+          <w:szCs w:val="17"/>
+        </w:rPr>
         <w:t>Residence</w:t>
       </w:r>
       <w:r>
@@ -1485,7 +1553,6 @@
           <w:sz w:val="17"/>
           <w:szCs w:val="17"/>
         </w:rPr>
-        <w:lastRenderedPageBreak/>
         <w:t>EDUCATIONAL BACKGROUND</w:t>
       </w:r>
     </w:p>
@@ -2359,8 +2426,8 @@
         <w:tblLook w:val="04A0" w:firstRow="1" w:lastRow="0" w:firstColumn="1" w:lastColumn="0" w:noHBand="0" w:noVBand="1"/>
       </w:tblPr>
       <w:tblGrid>
-        <w:gridCol w:w="835"/>
-        <w:gridCol w:w="3950"/>
+        <w:gridCol w:w="833"/>
+        <w:gridCol w:w="3952"/>
         <w:gridCol w:w="4215"/>
       </w:tblGrid>
       <w:tr>
@@ -2722,7 +2789,7 @@
                 <w:sz w:val="17"/>
                 <w:szCs w:val="17"/>
               </w:rPr>
-              <w:t xml:space="preserve">Prospect of career </w:t>
+              <w:t xml:space="preserve">Prospect of </w:t>
             </w:r>
             <w:r>
               <w:rPr>
@@ -2731,7 +2798,7 @@
                 <w:szCs w:val="17"/>
               </w:rPr>
               <w:lastRenderedPageBreak/>
-              <w:t>advancement</w:t>
+              <w:t>career advancement</w:t>
             </w:r>
           </w:p>
           <w:p>
@@ -2863,7 +2930,25 @@
                 <w:sz w:val="17"/>
                 <w:szCs w:val="17"/>
               </w:rPr>
-              <w:t>grades}[/]{</w:t>
+              <w:t>grades}</w:t>
+            </w:r>
+            <w:r>
+              <w:rPr>
+                <w:rFonts w:ascii="Arial" w:hAnsi="Arial" w:cs="Arial"/>
+                <w:b/>
+                <w:bCs/>
+                <w:sz w:val="17"/>
+                <w:szCs w:val="17"/>
+              </w:rPr>
+              <w:t>[/]</w:t>
+            </w:r>
+            <w:r>
+              <w:rPr>
+                <w:rFonts w:ascii="Arial" w:hAnsi="Arial" w:cs="Arial"/>
+                <w:sz w:val="17"/>
+                <w:szCs w:val="17"/>
+              </w:rPr>
+              <w:t>{</w:t>
             </w:r>
             <w:proofErr w:type="gramEnd"/>
             <w:r>
@@ -2952,7 +3037,25 @@
                 <w:sz w:val="17"/>
                 <w:szCs w:val="17"/>
               </w:rPr>
-              <w:t>grades}[/]{</w:t>
+              <w:t>grades}</w:t>
+            </w:r>
+            <w:r>
+              <w:rPr>
+                <w:rFonts w:ascii="Arial" w:hAnsi="Arial" w:cs="Arial"/>
+                <w:b/>
+                <w:bCs/>
+                <w:sz w:val="17"/>
+                <w:szCs w:val="17"/>
+              </w:rPr>
+              <w:t>[/]</w:t>
+            </w:r>
+            <w:r>
+              <w:rPr>
+                <w:rFonts w:ascii="Arial" w:hAnsi="Arial" w:cs="Arial"/>
+                <w:sz w:val="17"/>
+                <w:szCs w:val="17"/>
+              </w:rPr>
+              <w:t>{</w:t>
             </w:r>
             <w:proofErr w:type="gramEnd"/>
             <w:r>
@@ -3041,7 +3144,25 @@
                 <w:sz w:val="17"/>
                 <w:szCs w:val="17"/>
               </w:rPr>
-              <w:t>parents}[/]{</w:t>
+              <w:t>parents}</w:t>
+            </w:r>
+            <w:r>
+              <w:rPr>
+                <w:rFonts w:ascii="Arial" w:hAnsi="Arial" w:cs="Arial"/>
+                <w:b/>
+                <w:bCs/>
+                <w:sz w:val="17"/>
+                <w:szCs w:val="17"/>
+              </w:rPr>
+              <w:t>[/]</w:t>
+            </w:r>
+            <w:r>
+              <w:rPr>
+                <w:rFonts w:ascii="Arial" w:hAnsi="Arial" w:cs="Arial"/>
+                <w:sz w:val="17"/>
+                <w:szCs w:val="17"/>
+              </w:rPr>
+              <w:t>{</w:t>
             </w:r>
             <w:proofErr w:type="gramEnd"/>
             <w:r>
@@ -3130,7 +3251,25 @@
                 <w:sz w:val="17"/>
                 <w:szCs w:val="17"/>
               </w:rPr>
-              <w:t>peer}[/]{</w:t>
+              <w:t>peer}</w:t>
+            </w:r>
+            <w:r>
+              <w:rPr>
+                <w:rFonts w:ascii="Arial" w:hAnsi="Arial" w:cs="Arial"/>
+                <w:b/>
+                <w:bCs/>
+                <w:sz w:val="17"/>
+                <w:szCs w:val="17"/>
+              </w:rPr>
+              <w:t>[/]</w:t>
+            </w:r>
+            <w:r>
+              <w:rPr>
+                <w:rFonts w:ascii="Arial" w:hAnsi="Arial" w:cs="Arial"/>
+                <w:sz w:val="17"/>
+                <w:szCs w:val="17"/>
+              </w:rPr>
+              <w:t>{</w:t>
             </w:r>
             <w:proofErr w:type="gramEnd"/>
             <w:r>
@@ -3219,7 +3358,25 @@
                 <w:sz w:val="17"/>
                 <w:szCs w:val="17"/>
               </w:rPr>
-              <w:t>model}[/]{</w:t>
+              <w:t>model}</w:t>
+            </w:r>
+            <w:r>
+              <w:rPr>
+                <w:rFonts w:ascii="Arial" w:hAnsi="Arial" w:cs="Arial"/>
+                <w:b/>
+                <w:bCs/>
+                <w:sz w:val="17"/>
+                <w:szCs w:val="17"/>
+              </w:rPr>
+              <w:t>[/]</w:t>
+            </w:r>
+            <w:r>
+              <w:rPr>
+                <w:rFonts w:ascii="Arial" w:hAnsi="Arial" w:cs="Arial"/>
+                <w:sz w:val="17"/>
+                <w:szCs w:val="17"/>
+              </w:rPr>
+              <w:t>{</w:t>
             </w:r>
             <w:proofErr w:type="gramEnd"/>
             <w:r>
@@ -3308,7 +3465,25 @@
                 <w:sz w:val="17"/>
                 <w:szCs w:val="17"/>
               </w:rPr>
-              <w:t>passion}[/]{</w:t>
+              <w:t>passion}</w:t>
+            </w:r>
+            <w:r>
+              <w:rPr>
+                <w:rFonts w:ascii="Arial" w:hAnsi="Arial" w:cs="Arial"/>
+                <w:b/>
+                <w:bCs/>
+                <w:sz w:val="17"/>
+                <w:szCs w:val="17"/>
+              </w:rPr>
+              <w:t>[/]</w:t>
+            </w:r>
+            <w:r>
+              <w:rPr>
+                <w:rFonts w:ascii="Arial" w:hAnsi="Arial" w:cs="Arial"/>
+                <w:sz w:val="17"/>
+                <w:szCs w:val="17"/>
+              </w:rPr>
+              <w:t>{</w:t>
             </w:r>
             <w:proofErr w:type="gramEnd"/>
             <w:r>
@@ -3397,7 +3572,25 @@
                 <w:sz w:val="17"/>
                 <w:szCs w:val="17"/>
               </w:rPr>
-              <w:t>job}[/]{</w:t>
+              <w:t>job}</w:t>
+            </w:r>
+            <w:r>
+              <w:rPr>
+                <w:rFonts w:ascii="Arial" w:hAnsi="Arial" w:cs="Arial"/>
+                <w:b/>
+                <w:bCs/>
+                <w:sz w:val="17"/>
+                <w:szCs w:val="17"/>
+              </w:rPr>
+              <w:t>[/]</w:t>
+            </w:r>
+            <w:r>
+              <w:rPr>
+                <w:rFonts w:ascii="Arial" w:hAnsi="Arial" w:cs="Arial"/>
+                <w:sz w:val="17"/>
+                <w:szCs w:val="17"/>
+              </w:rPr>
+              <w:t>{</w:t>
             </w:r>
             <w:proofErr w:type="gramEnd"/>
             <w:r>
@@ -3486,7 +3679,25 @@
                 <w:sz w:val="17"/>
                 <w:szCs w:val="17"/>
               </w:rPr>
-              <w:t>prestige}[/]{</w:t>
+              <w:t>prestige}</w:t>
+            </w:r>
+            <w:r>
+              <w:rPr>
+                <w:rFonts w:ascii="Arial" w:hAnsi="Arial" w:cs="Arial"/>
+                <w:b/>
+                <w:bCs/>
+                <w:sz w:val="17"/>
+                <w:szCs w:val="17"/>
+              </w:rPr>
+              <w:t>[/]</w:t>
+            </w:r>
+            <w:r>
+              <w:rPr>
+                <w:rFonts w:ascii="Arial" w:hAnsi="Arial" w:cs="Arial"/>
+                <w:sz w:val="17"/>
+                <w:szCs w:val="17"/>
+              </w:rPr>
+              <w:t>{</w:t>
             </w:r>
             <w:proofErr w:type="gramEnd"/>
             <w:r>
@@ -3575,7 +3786,25 @@
                 <w:sz w:val="17"/>
                 <w:szCs w:val="17"/>
               </w:rPr>
-              <w:t>availability}[/]{</w:t>
+              <w:t>availability}</w:t>
+            </w:r>
+            <w:r>
+              <w:rPr>
+                <w:rFonts w:ascii="Arial" w:hAnsi="Arial" w:cs="Arial"/>
+                <w:b/>
+                <w:bCs/>
+                <w:sz w:val="17"/>
+                <w:szCs w:val="17"/>
+              </w:rPr>
+              <w:t>[/]</w:t>
+            </w:r>
+            <w:r>
+              <w:rPr>
+                <w:rFonts w:ascii="Arial" w:hAnsi="Arial" w:cs="Arial"/>
+                <w:sz w:val="17"/>
+                <w:szCs w:val="17"/>
+              </w:rPr>
+              <w:t>{</w:t>
             </w:r>
             <w:proofErr w:type="gramEnd"/>
             <w:r>
@@ -3664,7 +3893,25 @@
                 <w:sz w:val="17"/>
                 <w:szCs w:val="17"/>
               </w:rPr>
-              <w:t>career}[/]{</w:t>
+              <w:t>career}</w:t>
+            </w:r>
+            <w:r>
+              <w:rPr>
+                <w:rFonts w:ascii="Arial" w:hAnsi="Arial" w:cs="Arial"/>
+                <w:b/>
+                <w:bCs/>
+                <w:sz w:val="17"/>
+                <w:szCs w:val="17"/>
+              </w:rPr>
+              <w:t>[/]</w:t>
+            </w:r>
+            <w:r>
+              <w:rPr>
+                <w:rFonts w:ascii="Arial" w:hAnsi="Arial" w:cs="Arial"/>
+                <w:sz w:val="17"/>
+                <w:szCs w:val="17"/>
+              </w:rPr>
+              <w:t>{</w:t>
             </w:r>
             <w:proofErr w:type="gramEnd"/>
             <w:r>
@@ -3753,7 +4000,25 @@
                 <w:sz w:val="17"/>
                 <w:szCs w:val="17"/>
               </w:rPr>
-              <w:t>affordable}[/]{</w:t>
+              <w:t>affordable}</w:t>
+            </w:r>
+            <w:r>
+              <w:rPr>
+                <w:rFonts w:ascii="Arial" w:hAnsi="Arial" w:cs="Arial"/>
+                <w:b/>
+                <w:bCs/>
+                <w:sz w:val="17"/>
+                <w:szCs w:val="17"/>
+              </w:rPr>
+              <w:t>[/]</w:t>
+            </w:r>
+            <w:r>
+              <w:rPr>
+                <w:rFonts w:ascii="Arial" w:hAnsi="Arial" w:cs="Arial"/>
+                <w:sz w:val="17"/>
+                <w:szCs w:val="17"/>
+              </w:rPr>
+              <w:t>{</w:t>
             </w:r>
             <w:proofErr w:type="gramEnd"/>
             <w:r>
@@ -3842,7 +4107,25 @@
                 <w:sz w:val="17"/>
                 <w:szCs w:val="17"/>
               </w:rPr>
-              <w:t>compensation}[/]{</w:t>
+              <w:t>compensation}</w:t>
+            </w:r>
+            <w:r>
+              <w:rPr>
+                <w:rFonts w:ascii="Arial" w:hAnsi="Arial" w:cs="Arial"/>
+                <w:b/>
+                <w:bCs/>
+                <w:sz w:val="17"/>
+                <w:szCs w:val="17"/>
+              </w:rPr>
+              <w:t>[/]</w:t>
+            </w:r>
+            <w:r>
+              <w:rPr>
+                <w:rFonts w:ascii="Arial" w:hAnsi="Arial" w:cs="Arial"/>
+                <w:sz w:val="17"/>
+                <w:szCs w:val="17"/>
+              </w:rPr>
+              <w:t>{</w:t>
             </w:r>
             <w:proofErr w:type="gramEnd"/>
             <w:r>
@@ -3931,7 +4214,25 @@
                 <w:sz w:val="17"/>
                 <w:szCs w:val="17"/>
               </w:rPr>
-              <w:t>abroad}[/]{</w:t>
+              <w:t>abroad}</w:t>
+            </w:r>
+            <w:r>
+              <w:rPr>
+                <w:rFonts w:ascii="Arial" w:hAnsi="Arial" w:cs="Arial"/>
+                <w:b/>
+                <w:bCs/>
+                <w:sz w:val="17"/>
+                <w:szCs w:val="17"/>
+              </w:rPr>
+              <w:t>[/]</w:t>
+            </w:r>
+            <w:r>
+              <w:rPr>
+                <w:rFonts w:ascii="Arial" w:hAnsi="Arial" w:cs="Arial"/>
+                <w:sz w:val="17"/>
+                <w:szCs w:val="17"/>
+              </w:rPr>
+              <w:t>{</w:t>
             </w:r>
             <w:proofErr w:type="gramEnd"/>
             <w:r>
@@ -4020,7 +4321,25 @@
                 <w:sz w:val="17"/>
                 <w:szCs w:val="17"/>
               </w:rPr>
-              <w:t>choice}[/]{</w:t>
+              <w:t>choice}</w:t>
+            </w:r>
+            <w:r>
+              <w:rPr>
+                <w:rFonts w:ascii="Arial" w:hAnsi="Arial" w:cs="Arial"/>
+                <w:b/>
+                <w:bCs/>
+                <w:sz w:val="17"/>
+                <w:szCs w:val="17"/>
+              </w:rPr>
+              <w:t>[/]</w:t>
+            </w:r>
+            <w:r>
+              <w:rPr>
+                <w:rFonts w:ascii="Arial" w:hAnsi="Arial" w:cs="Arial"/>
+                <w:sz w:val="17"/>
+                <w:szCs w:val="17"/>
+              </w:rPr>
+              <w:t>{</w:t>
             </w:r>
             <w:proofErr w:type="gramEnd"/>
             <w:r>
@@ -4147,7 +4466,7 @@
                 <w:sz w:val="17"/>
                 <w:szCs w:val="17"/>
               </w:rPr>
-              <w:t>grades}[</w:t>
+              <w:t>grades}</w:t>
             </w:r>
             <w:r>
               <w:rPr>
@@ -4157,15 +4476,35 @@
                 <w:sz w:val="17"/>
                 <w:szCs w:val="17"/>
               </w:rPr>
+              <w:t>[</w:t>
+            </w:r>
+            <w:r>
+              <w:rPr>
+                <w:rFonts w:ascii="Arial" w:hAnsi="Arial" w:cs="Arial"/>
+                <w:b/>
+                <w:bCs/>
+                <w:sz w:val="17"/>
+                <w:szCs w:val="17"/>
+              </w:rPr>
               <w:t>/</w:t>
             </w:r>
             <w:r>
               <w:rPr>
                 <w:rFonts w:ascii="Arial" w:hAnsi="Arial" w:cs="Arial"/>
-                <w:sz w:val="17"/>
-                <w:szCs w:val="17"/>
-              </w:rPr>
-              <w:t>]{</w:t>
+                <w:b/>
+                <w:bCs/>
+                <w:sz w:val="17"/>
+                <w:szCs w:val="17"/>
+              </w:rPr>
+              <w:t>]</w:t>
+            </w:r>
+            <w:r>
+              <w:rPr>
+                <w:rFonts w:ascii="Arial" w:hAnsi="Arial" w:cs="Arial"/>
+                <w:sz w:val="17"/>
+                <w:szCs w:val="17"/>
+              </w:rPr>
+              <w:t>{</w:t>
             </w:r>
             <w:proofErr w:type="gramEnd"/>
             <w:r>
@@ -4322,7 +4661,7 @@
                 <w:sz w:val="17"/>
                 <w:szCs w:val="17"/>
               </w:rPr>
-              <w:t>grades}[</w:t>
+              <w:t>grades}</w:t>
             </w:r>
             <w:r>
               <w:rPr>
@@ -4332,15 +4671,35 @@
                 <w:sz w:val="17"/>
                 <w:szCs w:val="17"/>
               </w:rPr>
+              <w:t>[</w:t>
+            </w:r>
+            <w:r>
+              <w:rPr>
+                <w:rFonts w:ascii="Arial" w:hAnsi="Arial" w:cs="Arial"/>
+                <w:b/>
+                <w:bCs/>
+                <w:sz w:val="17"/>
+                <w:szCs w:val="17"/>
+              </w:rPr>
               <w:t>/</w:t>
             </w:r>
             <w:r>
               <w:rPr>
                 <w:rFonts w:ascii="Arial" w:hAnsi="Arial" w:cs="Arial"/>
-                <w:sz w:val="17"/>
-                <w:szCs w:val="17"/>
-              </w:rPr>
-              <w:t>]{</w:t>
+                <w:b/>
+                <w:bCs/>
+                <w:sz w:val="17"/>
+                <w:szCs w:val="17"/>
+              </w:rPr>
+              <w:t>]</w:t>
+            </w:r>
+            <w:r>
+              <w:rPr>
+                <w:rFonts w:ascii="Arial" w:hAnsi="Arial" w:cs="Arial"/>
+                <w:sz w:val="17"/>
+                <w:szCs w:val="17"/>
+              </w:rPr>
+              <w:t>{</w:t>
             </w:r>
             <w:proofErr w:type="gramEnd"/>
             <w:r>
@@ -4497,7 +4856,7 @@
                 <w:sz w:val="17"/>
                 <w:szCs w:val="17"/>
               </w:rPr>
-              <w:t>parents}[</w:t>
+              <w:t>parents}</w:t>
             </w:r>
             <w:r>
               <w:rPr>
@@ -4507,15 +4866,35 @@
                 <w:sz w:val="17"/>
                 <w:szCs w:val="17"/>
               </w:rPr>
+              <w:t>[</w:t>
+            </w:r>
+            <w:r>
+              <w:rPr>
+                <w:rFonts w:ascii="Arial" w:hAnsi="Arial" w:cs="Arial"/>
+                <w:b/>
+                <w:bCs/>
+                <w:sz w:val="17"/>
+                <w:szCs w:val="17"/>
+              </w:rPr>
               <w:t>/</w:t>
             </w:r>
             <w:r>
               <w:rPr>
                 <w:rFonts w:ascii="Arial" w:hAnsi="Arial" w:cs="Arial"/>
-                <w:sz w:val="17"/>
-                <w:szCs w:val="17"/>
-              </w:rPr>
-              <w:t>]{</w:t>
+                <w:b/>
+                <w:bCs/>
+                <w:sz w:val="17"/>
+                <w:szCs w:val="17"/>
+              </w:rPr>
+              <w:t>]</w:t>
+            </w:r>
+            <w:r>
+              <w:rPr>
+                <w:rFonts w:ascii="Arial" w:hAnsi="Arial" w:cs="Arial"/>
+                <w:sz w:val="17"/>
+                <w:szCs w:val="17"/>
+              </w:rPr>
+              <w:t>{</w:t>
             </w:r>
             <w:proofErr w:type="gramEnd"/>
             <w:r>
@@ -4672,7 +5051,7 @@
                 <w:sz w:val="17"/>
                 <w:szCs w:val="17"/>
               </w:rPr>
-              <w:t>peer}[</w:t>
+              <w:t>peer}</w:t>
             </w:r>
             <w:r>
               <w:rPr>
@@ -4682,15 +5061,35 @@
                 <w:sz w:val="17"/>
                 <w:szCs w:val="17"/>
               </w:rPr>
+              <w:t>[</w:t>
+            </w:r>
+            <w:r>
+              <w:rPr>
+                <w:rFonts w:ascii="Arial" w:hAnsi="Arial" w:cs="Arial"/>
+                <w:b/>
+                <w:bCs/>
+                <w:sz w:val="17"/>
+                <w:szCs w:val="17"/>
+              </w:rPr>
               <w:t>/</w:t>
             </w:r>
             <w:r>
               <w:rPr>
                 <w:rFonts w:ascii="Arial" w:hAnsi="Arial" w:cs="Arial"/>
-                <w:sz w:val="17"/>
-                <w:szCs w:val="17"/>
-              </w:rPr>
-              <w:t>]{</w:t>
+                <w:b/>
+                <w:bCs/>
+                <w:sz w:val="17"/>
+                <w:szCs w:val="17"/>
+              </w:rPr>
+              <w:t>]</w:t>
+            </w:r>
+            <w:r>
+              <w:rPr>
+                <w:rFonts w:ascii="Arial" w:hAnsi="Arial" w:cs="Arial"/>
+                <w:sz w:val="17"/>
+                <w:szCs w:val="17"/>
+              </w:rPr>
+              <w:t>{</w:t>
             </w:r>
             <w:proofErr w:type="gramEnd"/>
             <w:r>
@@ -4847,7 +5246,7 @@
                 <w:sz w:val="17"/>
                 <w:szCs w:val="17"/>
               </w:rPr>
-              <w:t>model}[</w:t>
+              <w:t>model}</w:t>
             </w:r>
             <w:r>
               <w:rPr>
@@ -4857,15 +5256,35 @@
                 <w:sz w:val="17"/>
                 <w:szCs w:val="17"/>
               </w:rPr>
+              <w:t>[</w:t>
+            </w:r>
+            <w:r>
+              <w:rPr>
+                <w:rFonts w:ascii="Arial" w:hAnsi="Arial" w:cs="Arial"/>
+                <w:b/>
+                <w:bCs/>
+                <w:sz w:val="17"/>
+                <w:szCs w:val="17"/>
+              </w:rPr>
               <w:t>/</w:t>
             </w:r>
             <w:r>
               <w:rPr>
                 <w:rFonts w:ascii="Arial" w:hAnsi="Arial" w:cs="Arial"/>
-                <w:sz w:val="17"/>
-                <w:szCs w:val="17"/>
-              </w:rPr>
-              <w:t>]{</w:t>
+                <w:b/>
+                <w:bCs/>
+                <w:sz w:val="17"/>
+                <w:szCs w:val="17"/>
+              </w:rPr>
+              <w:t>]</w:t>
+            </w:r>
+            <w:r>
+              <w:rPr>
+                <w:rFonts w:ascii="Arial" w:hAnsi="Arial" w:cs="Arial"/>
+                <w:sz w:val="17"/>
+                <w:szCs w:val="17"/>
+              </w:rPr>
+              <w:t>{</w:t>
             </w:r>
             <w:proofErr w:type="gramEnd"/>
             <w:r>
@@ -5022,7 +5441,7 @@
                 <w:sz w:val="17"/>
                 <w:szCs w:val="17"/>
               </w:rPr>
-              <w:t>passion}[</w:t>
+              <w:t>passion}</w:t>
             </w:r>
             <w:r>
               <w:rPr>
@@ -5032,15 +5451,35 @@
                 <w:sz w:val="17"/>
                 <w:szCs w:val="17"/>
               </w:rPr>
+              <w:t>[</w:t>
+            </w:r>
+            <w:r>
+              <w:rPr>
+                <w:rFonts w:ascii="Arial" w:hAnsi="Arial" w:cs="Arial"/>
+                <w:b/>
+                <w:bCs/>
+                <w:sz w:val="17"/>
+                <w:szCs w:val="17"/>
+              </w:rPr>
               <w:t>/</w:t>
             </w:r>
             <w:r>
               <w:rPr>
                 <w:rFonts w:ascii="Arial" w:hAnsi="Arial" w:cs="Arial"/>
-                <w:sz w:val="17"/>
-                <w:szCs w:val="17"/>
-              </w:rPr>
-              <w:t>]{</w:t>
+                <w:b/>
+                <w:bCs/>
+                <w:sz w:val="17"/>
+                <w:szCs w:val="17"/>
+              </w:rPr>
+              <w:t>]</w:t>
+            </w:r>
+            <w:r>
+              <w:rPr>
+                <w:rFonts w:ascii="Arial" w:hAnsi="Arial" w:cs="Arial"/>
+                <w:sz w:val="17"/>
+                <w:szCs w:val="17"/>
+              </w:rPr>
+              <w:t>{</w:t>
             </w:r>
             <w:proofErr w:type="gramEnd"/>
             <w:r>
@@ -5197,7 +5636,7 @@
                 <w:sz w:val="17"/>
                 <w:szCs w:val="17"/>
               </w:rPr>
-              <w:t>job}[</w:t>
+              <w:t>job}</w:t>
             </w:r>
             <w:r>
               <w:rPr>
@@ -5207,15 +5646,35 @@
                 <w:sz w:val="17"/>
                 <w:szCs w:val="17"/>
               </w:rPr>
+              <w:t>[</w:t>
+            </w:r>
+            <w:r>
+              <w:rPr>
+                <w:rFonts w:ascii="Arial" w:hAnsi="Arial" w:cs="Arial"/>
+                <w:b/>
+                <w:bCs/>
+                <w:sz w:val="17"/>
+                <w:szCs w:val="17"/>
+              </w:rPr>
               <w:t>/</w:t>
             </w:r>
             <w:r>
               <w:rPr>
                 <w:rFonts w:ascii="Arial" w:hAnsi="Arial" w:cs="Arial"/>
-                <w:sz w:val="17"/>
-                <w:szCs w:val="17"/>
-              </w:rPr>
-              <w:t>]{</w:t>
+                <w:b/>
+                <w:bCs/>
+                <w:sz w:val="17"/>
+                <w:szCs w:val="17"/>
+              </w:rPr>
+              <w:t>]</w:t>
+            </w:r>
+            <w:r>
+              <w:rPr>
+                <w:rFonts w:ascii="Arial" w:hAnsi="Arial" w:cs="Arial"/>
+                <w:sz w:val="17"/>
+                <w:szCs w:val="17"/>
+              </w:rPr>
+              <w:t>{</w:t>
             </w:r>
             <w:proofErr w:type="gramEnd"/>
             <w:r>
@@ -5372,7 +5831,7 @@
                 <w:sz w:val="17"/>
                 <w:szCs w:val="17"/>
               </w:rPr>
-              <w:t>prestige}[</w:t>
+              <w:t>prestige}</w:t>
             </w:r>
             <w:r>
               <w:rPr>
@@ -5382,15 +5841,35 @@
                 <w:sz w:val="17"/>
                 <w:szCs w:val="17"/>
               </w:rPr>
+              <w:t>[</w:t>
+            </w:r>
+            <w:r>
+              <w:rPr>
+                <w:rFonts w:ascii="Arial" w:hAnsi="Arial" w:cs="Arial"/>
+                <w:b/>
+                <w:bCs/>
+                <w:sz w:val="17"/>
+                <w:szCs w:val="17"/>
+              </w:rPr>
               <w:t>/</w:t>
             </w:r>
             <w:r>
               <w:rPr>
                 <w:rFonts w:ascii="Arial" w:hAnsi="Arial" w:cs="Arial"/>
-                <w:sz w:val="17"/>
-                <w:szCs w:val="17"/>
-              </w:rPr>
-              <w:t>]{</w:t>
+                <w:b/>
+                <w:bCs/>
+                <w:sz w:val="17"/>
+                <w:szCs w:val="17"/>
+              </w:rPr>
+              <w:t>]</w:t>
+            </w:r>
+            <w:r>
+              <w:rPr>
+                <w:rFonts w:ascii="Arial" w:hAnsi="Arial" w:cs="Arial"/>
+                <w:sz w:val="17"/>
+                <w:szCs w:val="17"/>
+              </w:rPr>
+              <w:t>{</w:t>
             </w:r>
             <w:proofErr w:type="gramEnd"/>
             <w:r>
@@ -5547,7 +6026,7 @@
                 <w:sz w:val="17"/>
                 <w:szCs w:val="17"/>
               </w:rPr>
-              <w:t>availability}[</w:t>
+              <w:t>availability}</w:t>
             </w:r>
             <w:r>
               <w:rPr>
@@ -5557,15 +6036,35 @@
                 <w:sz w:val="17"/>
                 <w:szCs w:val="17"/>
               </w:rPr>
+              <w:t>[</w:t>
+            </w:r>
+            <w:r>
+              <w:rPr>
+                <w:rFonts w:ascii="Arial" w:hAnsi="Arial" w:cs="Arial"/>
+                <w:b/>
+                <w:bCs/>
+                <w:sz w:val="17"/>
+                <w:szCs w:val="17"/>
+              </w:rPr>
               <w:t>/</w:t>
             </w:r>
             <w:r>
               <w:rPr>
                 <w:rFonts w:ascii="Arial" w:hAnsi="Arial" w:cs="Arial"/>
-                <w:sz w:val="17"/>
-                <w:szCs w:val="17"/>
-              </w:rPr>
-              <w:t>]{</w:t>
+                <w:b/>
+                <w:bCs/>
+                <w:sz w:val="17"/>
+                <w:szCs w:val="17"/>
+              </w:rPr>
+              <w:t>]</w:t>
+            </w:r>
+            <w:r>
+              <w:rPr>
+                <w:rFonts w:ascii="Arial" w:hAnsi="Arial" w:cs="Arial"/>
+                <w:sz w:val="17"/>
+                <w:szCs w:val="17"/>
+              </w:rPr>
+              <w:t>{</w:t>
             </w:r>
             <w:proofErr w:type="gramEnd"/>
             <w:r>
@@ -5722,7 +6221,7 @@
                 <w:sz w:val="17"/>
                 <w:szCs w:val="17"/>
               </w:rPr>
-              <w:t>career}[</w:t>
+              <w:t>career}</w:t>
             </w:r>
             <w:r>
               <w:rPr>
@@ -5732,15 +6231,35 @@
                 <w:sz w:val="17"/>
                 <w:szCs w:val="17"/>
               </w:rPr>
+              <w:t>[</w:t>
+            </w:r>
+            <w:r>
+              <w:rPr>
+                <w:rFonts w:ascii="Arial" w:hAnsi="Arial" w:cs="Arial"/>
+                <w:b/>
+                <w:bCs/>
+                <w:sz w:val="17"/>
+                <w:szCs w:val="17"/>
+              </w:rPr>
               <w:t>/</w:t>
             </w:r>
             <w:r>
               <w:rPr>
                 <w:rFonts w:ascii="Arial" w:hAnsi="Arial" w:cs="Arial"/>
-                <w:sz w:val="17"/>
-                <w:szCs w:val="17"/>
-              </w:rPr>
-              <w:t>]{</w:t>
+                <w:b/>
+                <w:bCs/>
+                <w:sz w:val="17"/>
+                <w:szCs w:val="17"/>
+              </w:rPr>
+              <w:t>]</w:t>
+            </w:r>
+            <w:r>
+              <w:rPr>
+                <w:rFonts w:ascii="Arial" w:hAnsi="Arial" w:cs="Arial"/>
+                <w:sz w:val="17"/>
+                <w:szCs w:val="17"/>
+              </w:rPr>
+              <w:t>{</w:t>
             </w:r>
             <w:proofErr w:type="gramEnd"/>
             <w:r>
@@ -5897,7 +6416,7 @@
                 <w:sz w:val="17"/>
                 <w:szCs w:val="17"/>
               </w:rPr>
-              <w:t>affordable}[</w:t>
+              <w:t>affordable}</w:t>
             </w:r>
             <w:r>
               <w:rPr>
@@ -5907,15 +6426,35 @@
                 <w:sz w:val="17"/>
                 <w:szCs w:val="17"/>
               </w:rPr>
+              <w:t>[</w:t>
+            </w:r>
+            <w:r>
+              <w:rPr>
+                <w:rFonts w:ascii="Arial" w:hAnsi="Arial" w:cs="Arial"/>
+                <w:b/>
+                <w:bCs/>
+                <w:sz w:val="17"/>
+                <w:szCs w:val="17"/>
+              </w:rPr>
               <w:t>/</w:t>
             </w:r>
             <w:r>
               <w:rPr>
                 <w:rFonts w:ascii="Arial" w:hAnsi="Arial" w:cs="Arial"/>
-                <w:sz w:val="17"/>
-                <w:szCs w:val="17"/>
-              </w:rPr>
-              <w:t>]{</w:t>
+                <w:b/>
+                <w:bCs/>
+                <w:sz w:val="17"/>
+                <w:szCs w:val="17"/>
+              </w:rPr>
+              <w:t>]</w:t>
+            </w:r>
+            <w:r>
+              <w:rPr>
+                <w:rFonts w:ascii="Arial" w:hAnsi="Arial" w:cs="Arial"/>
+                <w:sz w:val="17"/>
+                <w:szCs w:val="17"/>
+              </w:rPr>
+              <w:t>{</w:t>
             </w:r>
             <w:proofErr w:type="gramEnd"/>
             <w:r>
@@ -6072,7 +6611,7 @@
                 <w:sz w:val="17"/>
                 <w:szCs w:val="17"/>
               </w:rPr>
-              <w:t>compensation}[</w:t>
+              <w:t>compensation}</w:t>
             </w:r>
             <w:r>
               <w:rPr>
@@ -6082,15 +6621,35 @@
                 <w:sz w:val="17"/>
                 <w:szCs w:val="17"/>
               </w:rPr>
+              <w:t>[</w:t>
+            </w:r>
+            <w:r>
+              <w:rPr>
+                <w:rFonts w:ascii="Arial" w:hAnsi="Arial" w:cs="Arial"/>
+                <w:b/>
+                <w:bCs/>
+                <w:sz w:val="17"/>
+                <w:szCs w:val="17"/>
+              </w:rPr>
               <w:t>/</w:t>
             </w:r>
             <w:r>
               <w:rPr>
                 <w:rFonts w:ascii="Arial" w:hAnsi="Arial" w:cs="Arial"/>
-                <w:sz w:val="17"/>
-                <w:szCs w:val="17"/>
-              </w:rPr>
-              <w:t>]{</w:t>
+                <w:b/>
+                <w:bCs/>
+                <w:sz w:val="17"/>
+                <w:szCs w:val="17"/>
+              </w:rPr>
+              <w:t>]</w:t>
+            </w:r>
+            <w:r>
+              <w:rPr>
+                <w:rFonts w:ascii="Arial" w:hAnsi="Arial" w:cs="Arial"/>
+                <w:sz w:val="17"/>
+                <w:szCs w:val="17"/>
+              </w:rPr>
+              <w:t>{</w:t>
             </w:r>
             <w:proofErr w:type="gramEnd"/>
             <w:r>
@@ -6247,7 +6806,7 @@
                 <w:sz w:val="17"/>
                 <w:szCs w:val="17"/>
               </w:rPr>
-              <w:t>abroad}[</w:t>
+              <w:t>abroad}</w:t>
             </w:r>
             <w:r>
               <w:rPr>
@@ -6257,15 +6816,35 @@
                 <w:sz w:val="17"/>
                 <w:szCs w:val="17"/>
               </w:rPr>
+              <w:t>[</w:t>
+            </w:r>
+            <w:r>
+              <w:rPr>
+                <w:rFonts w:ascii="Arial" w:hAnsi="Arial" w:cs="Arial"/>
+                <w:b/>
+                <w:bCs/>
+                <w:sz w:val="17"/>
+                <w:szCs w:val="17"/>
+              </w:rPr>
               <w:t>/</w:t>
             </w:r>
             <w:r>
               <w:rPr>
                 <w:rFonts w:ascii="Arial" w:hAnsi="Arial" w:cs="Arial"/>
-                <w:sz w:val="17"/>
-                <w:szCs w:val="17"/>
-              </w:rPr>
-              <w:t>]{</w:t>
+                <w:b/>
+                <w:bCs/>
+                <w:sz w:val="17"/>
+                <w:szCs w:val="17"/>
+              </w:rPr>
+              <w:t>]</w:t>
+            </w:r>
+            <w:r>
+              <w:rPr>
+                <w:rFonts w:ascii="Arial" w:hAnsi="Arial" w:cs="Arial"/>
+                <w:sz w:val="17"/>
+                <w:szCs w:val="17"/>
+              </w:rPr>
+              <w:t>{</w:t>
             </w:r>
             <w:proofErr w:type="gramEnd"/>
             <w:r>
@@ -6422,7 +7001,7 @@
                 <w:sz w:val="17"/>
                 <w:szCs w:val="17"/>
               </w:rPr>
-              <w:t>choice}[</w:t>
+              <w:t>choice}</w:t>
             </w:r>
             <w:r>
               <w:rPr>
@@ -6432,15 +7011,35 @@
                 <w:sz w:val="17"/>
                 <w:szCs w:val="17"/>
               </w:rPr>
+              <w:t>[</w:t>
+            </w:r>
+            <w:r>
+              <w:rPr>
+                <w:rFonts w:ascii="Arial" w:hAnsi="Arial" w:cs="Arial"/>
+                <w:b/>
+                <w:bCs/>
+                <w:sz w:val="17"/>
+                <w:szCs w:val="17"/>
+              </w:rPr>
               <w:t>/</w:t>
             </w:r>
             <w:r>
               <w:rPr>
                 <w:rFonts w:ascii="Arial" w:hAnsi="Arial" w:cs="Arial"/>
-                <w:sz w:val="17"/>
-                <w:szCs w:val="17"/>
-              </w:rPr>
-              <w:t>]{</w:t>
+                <w:b/>
+                <w:bCs/>
+                <w:sz w:val="17"/>
+                <w:szCs w:val="17"/>
+              </w:rPr>
+              <w:t>]</w:t>
+            </w:r>
+            <w:r>
+              <w:rPr>
+                <w:rFonts w:ascii="Arial" w:hAnsi="Arial" w:cs="Arial"/>
+                <w:sz w:val="17"/>
+                <w:szCs w:val="17"/>
+              </w:rPr>
+              <w:t>{</w:t>
             </w:r>
             <w:proofErr w:type="gramEnd"/>
             <w:r>
@@ -7209,7 +7808,17 @@
           <w:sz w:val="17"/>
           <w:szCs w:val="17"/>
         </w:rPr>
-        <w:t>[/] For promotion</w:t>
+        <w:t xml:space="preserve">[/] </w:t>
+      </w:r>
+      <w:r>
+        <w:rPr>
+          <w:rFonts w:ascii="Arial" w:hAnsi="Arial" w:cs="Arial"/>
+          <w:b/>
+          <w:bCs/>
+          <w:sz w:val="17"/>
+          <w:szCs w:val="17"/>
+        </w:rPr>
+        <w:t>For promotion</w:t>
       </w:r>
     </w:p>
     <w:p>
@@ -7304,7 +7913,17 @@
           <w:sz w:val="17"/>
           <w:szCs w:val="17"/>
         </w:rPr>
-        <w:t>[/] For professional development</w:t>
+        <w:t xml:space="preserve">[/] </w:t>
+      </w:r>
+      <w:r>
+        <w:rPr>
+          <w:rFonts w:ascii="Arial" w:hAnsi="Arial" w:cs="Arial"/>
+          <w:b/>
+          <w:bCs/>
+          <w:sz w:val="17"/>
+          <w:szCs w:val="17"/>
+        </w:rPr>
+        <w:t>For professional development</w:t>
       </w:r>
     </w:p>
     <w:p>
@@ -7407,12 +8026,24 @@
           <w:sz w:val="17"/>
           <w:szCs w:val="17"/>
         </w:rPr>
-        <w:t>[/] Others, please specify: {</w:t>
+        <w:t xml:space="preserve">[/] Others, please specify: </w:t>
+      </w:r>
+      <w:r>
+        <w:rPr>
+          <w:rFonts w:ascii="Arial" w:hAnsi="Arial" w:cs="Arial"/>
+          <w:b/>
+          <w:bCs/>
+          <w:sz w:val="17"/>
+          <w:szCs w:val="17"/>
+        </w:rPr>
+        <w:t>{</w:t>
       </w:r>
       <w:proofErr w:type="spellStart"/>
       <w:r>
         <w:rPr>
           <w:rFonts w:ascii="Arial" w:hAnsi="Arial" w:cs="Arial"/>
+          <w:b/>
+          <w:bCs/>
           <w:sz w:val="17"/>
           <w:szCs w:val="17"/>
         </w:rPr>
@@ -7422,6 +8053,8 @@
       <w:r>
         <w:rPr>
           <w:rFonts w:ascii="Arial" w:hAnsi="Arial" w:cs="Arial"/>
+          <w:b/>
+          <w:bCs/>
           <w:sz w:val="17"/>
           <w:szCs w:val="17"/>
         </w:rPr>
@@ -7622,7 +8255,25 @@
           <w:sz w:val="17"/>
           <w:szCs w:val="17"/>
         </w:rPr>
-        <w:t>/] Yes{/</w:t>
+        <w:t xml:space="preserve">/] </w:t>
+      </w:r>
+      <w:r>
+        <w:rPr>
+          <w:rFonts w:ascii="Arial" w:hAnsi="Arial" w:cs="Arial"/>
+          <w:b/>
+          <w:bCs/>
+          <w:sz w:val="17"/>
+          <w:szCs w:val="17"/>
+        </w:rPr>
+        <w:t>Yes</w:t>
+      </w:r>
+      <w:r>
+        <w:rPr>
+          <w:rFonts w:ascii="Arial" w:hAnsi="Arial" w:cs="Arial"/>
+          <w:sz w:val="17"/>
+          <w:szCs w:val="17"/>
+        </w:rPr>
+        <w:t>{/</w:t>
       </w:r>
       <w:proofErr w:type="spellStart"/>
       <w:proofErr w:type="gramStart"/>
@@ -7704,7 +8355,25 @@
           <w:sz w:val="17"/>
           <w:szCs w:val="17"/>
         </w:rPr>
-        <w:t>/] No{/</w:t>
+        <w:t xml:space="preserve">/] </w:t>
+      </w:r>
+      <w:r>
+        <w:rPr>
+          <w:rFonts w:ascii="Arial" w:hAnsi="Arial" w:cs="Arial"/>
+          <w:b/>
+          <w:bCs/>
+          <w:sz w:val="17"/>
+          <w:szCs w:val="17"/>
+        </w:rPr>
+        <w:t>No</w:t>
+      </w:r>
+      <w:r>
+        <w:rPr>
+          <w:rFonts w:ascii="Arial" w:hAnsi="Arial" w:cs="Arial"/>
+          <w:sz w:val="17"/>
+          <w:szCs w:val="17"/>
+        </w:rPr>
+        <w:t>{/</w:t>
       </w:r>
       <w:proofErr w:type="spellStart"/>
       <w:proofErr w:type="gramStart"/>
@@ -7786,7 +8455,25 @@
           <w:sz w:val="17"/>
           <w:szCs w:val="17"/>
         </w:rPr>
-        <w:t>/] Never Employed{/</w:t>
+        <w:t xml:space="preserve">/] </w:t>
+      </w:r>
+      <w:r>
+        <w:rPr>
+          <w:rFonts w:ascii="Arial" w:hAnsi="Arial" w:cs="Arial"/>
+          <w:b/>
+          <w:bCs/>
+          <w:sz w:val="17"/>
+          <w:szCs w:val="17"/>
+        </w:rPr>
+        <w:t>Never Employed</w:t>
+      </w:r>
+      <w:r>
+        <w:rPr>
+          <w:rFonts w:ascii="Arial" w:hAnsi="Arial" w:cs="Arial"/>
+          <w:sz w:val="17"/>
+          <w:szCs w:val="17"/>
+        </w:rPr>
+        <w:t>{/</w:t>
       </w:r>
       <w:proofErr w:type="spellStart"/>
       <w:proofErr w:type="gramStart"/>
@@ -7941,17 +8628,29 @@
         <w:spacing w:after="0" w:line="240" w:lineRule="auto"/>
         <w:rPr>
           <w:rFonts w:ascii="Arial" w:hAnsi="Arial" w:cs="Arial"/>
-          <w:sz w:val="17"/>
-          <w:szCs w:val="17"/>
-        </w:rPr>
-      </w:pPr>
-      <w:r>
-        <w:rPr>
-          <w:rFonts w:ascii="Arial" w:hAnsi="Arial" w:cs="Arial"/>
-          <w:sz w:val="17"/>
-          <w:szCs w:val="17"/>
-        </w:rPr>
-        <w:t>[/] Advance or further study</w:t>
+          <w:b/>
+          <w:bCs/>
+          <w:sz w:val="17"/>
+          <w:szCs w:val="17"/>
+        </w:rPr>
+      </w:pPr>
+      <w:r>
+        <w:rPr>
+          <w:rFonts w:ascii="Arial" w:hAnsi="Arial" w:cs="Arial"/>
+          <w:sz w:val="17"/>
+          <w:szCs w:val="17"/>
+        </w:rPr>
+        <w:t xml:space="preserve">[/] </w:t>
+      </w:r>
+      <w:r>
+        <w:rPr>
+          <w:rFonts w:ascii="Arial" w:hAnsi="Arial" w:cs="Arial"/>
+          <w:b/>
+          <w:bCs/>
+          <w:sz w:val="17"/>
+          <w:szCs w:val="17"/>
+        </w:rPr>
+        <w:t>Advance or further study</w:t>
       </w:r>
     </w:p>
     <w:p>
@@ -8054,7 +8753,17 @@
           <w:sz w:val="17"/>
           <w:szCs w:val="17"/>
         </w:rPr>
-        <w:t>[/] Family concern and decided not to find a job</w:t>
+        <w:t xml:space="preserve">[/] </w:t>
+      </w:r>
+      <w:r>
+        <w:rPr>
+          <w:rFonts w:ascii="Arial" w:hAnsi="Arial" w:cs="Arial"/>
+          <w:b/>
+          <w:bCs/>
+          <w:sz w:val="17"/>
+          <w:szCs w:val="17"/>
+        </w:rPr>
+        <w:t>Family concern and decided not to find a job</w:t>
       </w:r>
     </w:p>
     <w:p>
@@ -8147,17 +8856,29 @@
         <w:spacing w:after="0" w:line="240" w:lineRule="auto"/>
         <w:rPr>
           <w:rFonts w:ascii="Arial" w:hAnsi="Arial" w:cs="Arial"/>
-          <w:sz w:val="17"/>
-          <w:szCs w:val="17"/>
-        </w:rPr>
-      </w:pPr>
-      <w:r>
-        <w:rPr>
-          <w:rFonts w:ascii="Arial" w:hAnsi="Arial" w:cs="Arial"/>
-          <w:sz w:val="17"/>
-          <w:szCs w:val="17"/>
-        </w:rPr>
-        <w:t>[/] Health-related reason(s)</w:t>
+          <w:b/>
+          <w:bCs/>
+          <w:sz w:val="17"/>
+          <w:szCs w:val="17"/>
+        </w:rPr>
+      </w:pPr>
+      <w:r>
+        <w:rPr>
+          <w:rFonts w:ascii="Arial" w:hAnsi="Arial" w:cs="Arial"/>
+          <w:sz w:val="17"/>
+          <w:szCs w:val="17"/>
+        </w:rPr>
+        <w:t xml:space="preserve">[/] </w:t>
+      </w:r>
+      <w:r>
+        <w:rPr>
+          <w:rFonts w:ascii="Arial" w:hAnsi="Arial" w:cs="Arial"/>
+          <w:b/>
+          <w:bCs/>
+          <w:sz w:val="17"/>
+          <w:szCs w:val="17"/>
+        </w:rPr>
+        <w:t>Health-related reason(s)</w:t>
       </w:r>
     </w:p>
     <w:p>
@@ -8260,7 +8981,17 @@
           <w:sz w:val="17"/>
           <w:szCs w:val="17"/>
         </w:rPr>
-        <w:t>[/] Lack of work experience</w:t>
+        <w:t xml:space="preserve">[/] </w:t>
+      </w:r>
+      <w:r>
+        <w:rPr>
+          <w:rFonts w:ascii="Arial" w:hAnsi="Arial" w:cs="Arial"/>
+          <w:b/>
+          <w:bCs/>
+          <w:sz w:val="17"/>
+          <w:szCs w:val="17"/>
+        </w:rPr>
+        <w:t>Lack of work experience</w:t>
       </w:r>
     </w:p>
     <w:p>
@@ -8363,7 +9094,17 @@
           <w:sz w:val="17"/>
           <w:szCs w:val="17"/>
         </w:rPr>
-        <w:t>[/] No job opportunity</w:t>
+        <w:t xml:space="preserve">[/] </w:t>
+      </w:r>
+      <w:r>
+        <w:rPr>
+          <w:rFonts w:ascii="Arial" w:hAnsi="Arial" w:cs="Arial"/>
+          <w:b/>
+          <w:bCs/>
+          <w:sz w:val="17"/>
+          <w:szCs w:val="17"/>
+        </w:rPr>
+        <w:t>No job opportunity</w:t>
       </w:r>
     </w:p>
     <w:p>
@@ -8466,25 +9207,36 @@
           <w:sz w:val="17"/>
           <w:szCs w:val="17"/>
         </w:rPr>
-        <w:t>[/] Did not look for a job</w:t>
-      </w:r>
-    </w:p>
-    <w:p>
-      <w:pPr>
-        <w:pStyle w:val="ListParagraph"/>
-        <w:spacing w:after="0" w:line="240" w:lineRule="auto"/>
-        <w:rPr>
-          <w:rFonts w:ascii="Arial" w:hAnsi="Arial" w:cs="Arial"/>
-          <w:sz w:val="17"/>
-          <w:szCs w:val="17"/>
-        </w:rPr>
-      </w:pPr>
-      <w:r>
-        <w:rPr>
-          <w:rFonts w:ascii="Arial" w:hAnsi="Arial" w:cs="Arial"/>
-          <w:sz w:val="17"/>
-          <w:szCs w:val="17"/>
-        </w:rPr>
+        <w:t xml:space="preserve">[/] </w:t>
+      </w:r>
+      <w:r>
+        <w:rPr>
+          <w:rFonts w:ascii="Arial" w:hAnsi="Arial" w:cs="Arial"/>
+          <w:b/>
+          <w:bCs/>
+          <w:sz w:val="17"/>
+          <w:szCs w:val="17"/>
+        </w:rPr>
+        <w:t>Did not look for a job</w:t>
+      </w:r>
+    </w:p>
+    <w:p>
+      <w:pPr>
+        <w:pStyle w:val="ListParagraph"/>
+        <w:spacing w:after="0" w:line="240" w:lineRule="auto"/>
+        <w:rPr>
+          <w:rFonts w:ascii="Arial" w:hAnsi="Arial" w:cs="Arial"/>
+          <w:sz w:val="17"/>
+          <w:szCs w:val="17"/>
+        </w:rPr>
+      </w:pPr>
+      <w:r>
+        <w:rPr>
+          <w:rFonts w:ascii="Arial" w:hAnsi="Arial" w:cs="Arial"/>
+          <w:sz w:val="17"/>
+          <w:szCs w:val="17"/>
+        </w:rPr>
+        <w:lastRenderedPageBreak/>
         <w:t>{/</w:t>
       </w:r>
       <w:proofErr w:type="spellStart"/>
@@ -8532,7 +9284,6 @@
           <w:sz w:val="17"/>
           <w:szCs w:val="17"/>
         </w:rPr>
-        <w:lastRenderedPageBreak/>
         <w:t>{#</w:t>
       </w:r>
       <w:proofErr w:type="gramStart"/>
@@ -8570,12 +9321,24 @@
           <w:sz w:val="17"/>
           <w:szCs w:val="17"/>
         </w:rPr>
-        <w:t>[/] Other reason(s), please specify: {</w:t>
+        <w:t xml:space="preserve">[/] Other reason(s), please specify: </w:t>
+      </w:r>
+      <w:r>
+        <w:rPr>
+          <w:rFonts w:ascii="Arial" w:hAnsi="Arial" w:cs="Arial"/>
+          <w:b/>
+          <w:bCs/>
+          <w:sz w:val="17"/>
+          <w:szCs w:val="17"/>
+        </w:rPr>
+        <w:t>{</w:t>
       </w:r>
       <w:proofErr w:type="spellStart"/>
       <w:r>
         <w:rPr>
           <w:rFonts w:ascii="Arial" w:hAnsi="Arial" w:cs="Arial"/>
+          <w:b/>
+          <w:bCs/>
           <w:sz w:val="17"/>
           <w:szCs w:val="17"/>
         </w:rPr>
@@ -8585,6 +9348,8 @@
       <w:r>
         <w:rPr>
           <w:rFonts w:ascii="Arial" w:hAnsi="Arial" w:cs="Arial"/>
+          <w:b/>
+          <w:bCs/>
           <w:sz w:val="17"/>
           <w:szCs w:val="17"/>
         </w:rPr>
@@ -8715,17 +9480,29 @@
         <w:spacing w:after="0" w:line="240" w:lineRule="auto"/>
         <w:rPr>
           <w:rFonts w:ascii="Arial" w:hAnsi="Arial" w:cs="Arial"/>
-          <w:sz w:val="17"/>
-          <w:szCs w:val="17"/>
-        </w:rPr>
-      </w:pPr>
-      <w:r>
-        <w:rPr>
-          <w:rFonts w:ascii="Arial" w:hAnsi="Arial" w:cs="Arial"/>
-          <w:sz w:val="17"/>
-          <w:szCs w:val="17"/>
-        </w:rPr>
-        <w:t>[/] Regular or Permanent</w:t>
+          <w:b/>
+          <w:bCs/>
+          <w:sz w:val="17"/>
+          <w:szCs w:val="17"/>
+        </w:rPr>
+      </w:pPr>
+      <w:r>
+        <w:rPr>
+          <w:rFonts w:ascii="Arial" w:hAnsi="Arial" w:cs="Arial"/>
+          <w:sz w:val="17"/>
+          <w:szCs w:val="17"/>
+        </w:rPr>
+        <w:t xml:space="preserve">[/] </w:t>
+      </w:r>
+      <w:r>
+        <w:rPr>
+          <w:rFonts w:ascii="Arial" w:hAnsi="Arial" w:cs="Arial"/>
+          <w:b/>
+          <w:bCs/>
+          <w:sz w:val="17"/>
+          <w:szCs w:val="17"/>
+        </w:rPr>
+        <w:t>Regular or Permanent</w:t>
       </w:r>
     </w:p>
     <w:p>
@@ -8828,7 +9605,17 @@
           <w:sz w:val="17"/>
           <w:szCs w:val="17"/>
         </w:rPr>
-        <w:t>[/] Contractual</w:t>
+        <w:t>[/]</w:t>
+      </w:r>
+      <w:r>
+        <w:rPr>
+          <w:rFonts w:ascii="Arial" w:hAnsi="Arial" w:cs="Arial"/>
+          <w:b/>
+          <w:bCs/>
+          <w:sz w:val="17"/>
+          <w:szCs w:val="17"/>
+        </w:rPr>
+        <w:t xml:space="preserve"> Contractual</w:t>
       </w:r>
     </w:p>
     <w:p>
@@ -8923,7 +9710,17 @@
           <w:sz w:val="17"/>
           <w:szCs w:val="17"/>
         </w:rPr>
-        <w:t>[/] Temporary</w:t>
+        <w:t xml:space="preserve">[/] </w:t>
+      </w:r>
+      <w:r>
+        <w:rPr>
+          <w:rFonts w:ascii="Arial" w:hAnsi="Arial" w:cs="Arial"/>
+          <w:b/>
+          <w:bCs/>
+          <w:sz w:val="17"/>
+          <w:szCs w:val="17"/>
+        </w:rPr>
+        <w:t>Temporary</w:t>
       </w:r>
     </w:p>
     <w:p>
@@ -9018,7 +9815,17 @@
           <w:sz w:val="17"/>
           <w:szCs w:val="17"/>
         </w:rPr>
-        <w:t>[/] Self-employed</w:t>
+        <w:t xml:space="preserve">[/] </w:t>
+      </w:r>
+      <w:r>
+        <w:rPr>
+          <w:rFonts w:ascii="Arial" w:hAnsi="Arial" w:cs="Arial"/>
+          <w:b/>
+          <w:bCs/>
+          <w:sz w:val="17"/>
+          <w:szCs w:val="17"/>
+        </w:rPr>
+        <w:t>Self-employed</w:t>
       </w:r>
     </w:p>
     <w:p>
@@ -9046,13 +9853,17 @@
         <w:spacing w:after="0" w:line="240" w:lineRule="auto"/>
         <w:rPr>
           <w:rFonts w:ascii="Arial" w:hAnsi="Arial" w:cs="Arial"/>
-          <w:sz w:val="17"/>
-          <w:szCs w:val="17"/>
-        </w:rPr>
-      </w:pPr>
-      <w:r>
-        <w:rPr>
-          <w:rFonts w:ascii="Arial" w:hAnsi="Arial" w:cs="Arial"/>
+          <w:b/>
+          <w:bCs/>
+          <w:sz w:val="17"/>
+          <w:szCs w:val="17"/>
+        </w:rPr>
+      </w:pPr>
+      <w:r>
+        <w:rPr>
+          <w:rFonts w:ascii="Arial" w:hAnsi="Arial" w:cs="Arial"/>
+          <w:b/>
+          <w:bCs/>
           <w:sz w:val="17"/>
           <w:szCs w:val="17"/>
         </w:rPr>
@@ -9062,6 +9873,8 @@
       <w:r>
         <w:rPr>
           <w:rFonts w:ascii="Arial" w:hAnsi="Arial" w:cs="Arial"/>
+          <w:b/>
+          <w:bCs/>
           <w:sz w:val="17"/>
           <w:szCs w:val="17"/>
         </w:rPr>
@@ -9071,6 +9884,8 @@
       <w:r>
         <w:rPr>
           <w:rFonts w:ascii="Arial" w:hAnsi="Arial" w:cs="Arial"/>
+          <w:b/>
+          <w:bCs/>
           <w:sz w:val="17"/>
           <w:szCs w:val="17"/>
         </w:rPr>
@@ -9164,13 +9979,17 @@
         <w:spacing w:after="0" w:line="240" w:lineRule="auto"/>
         <w:rPr>
           <w:rFonts w:ascii="Arial" w:hAnsi="Arial" w:cs="Arial"/>
-          <w:sz w:val="17"/>
-          <w:szCs w:val="17"/>
-        </w:rPr>
-      </w:pPr>
-      <w:r>
-        <w:rPr>
-          <w:rFonts w:ascii="Arial" w:hAnsi="Arial" w:cs="Arial"/>
+          <w:b/>
+          <w:bCs/>
+          <w:sz w:val="17"/>
+          <w:szCs w:val="17"/>
+        </w:rPr>
+      </w:pPr>
+      <w:r>
+        <w:rPr>
+          <w:rFonts w:ascii="Arial" w:hAnsi="Arial" w:cs="Arial"/>
+          <w:b/>
+          <w:bCs/>
           <w:sz w:val="17"/>
           <w:szCs w:val="17"/>
         </w:rPr>
@@ -9180,6 +9999,8 @@
       <w:r>
         <w:rPr>
           <w:rFonts w:ascii="Arial" w:hAnsi="Arial" w:cs="Arial"/>
+          <w:b/>
+          <w:bCs/>
           <w:sz w:val="17"/>
           <w:szCs w:val="17"/>
         </w:rPr>
@@ -9189,6 +10010,8 @@
       <w:r>
         <w:rPr>
           <w:rFonts w:ascii="Arial" w:hAnsi="Arial" w:cs="Arial"/>
+          <w:b/>
+          <w:bCs/>
           <w:sz w:val="17"/>
           <w:szCs w:val="17"/>
         </w:rPr>
@@ -9282,7 +10105,17 @@
           <w:sz w:val="17"/>
           <w:szCs w:val="17"/>
         </w:rPr>
-        <w:t>[/] Agriculture, Hunting and Forestry</w:t>
+        <w:t xml:space="preserve">[/] </w:t>
+      </w:r>
+      <w:r>
+        <w:rPr>
+          <w:rFonts w:ascii="Arial" w:hAnsi="Arial" w:cs="Arial"/>
+          <w:b/>
+          <w:bCs/>
+          <w:sz w:val="17"/>
+          <w:szCs w:val="17"/>
+        </w:rPr>
+        <w:t>Agriculture, Hunting and Forestry</w:t>
       </w:r>
     </w:p>
     <w:p>
@@ -9385,7 +10218,17 @@
           <w:sz w:val="17"/>
           <w:szCs w:val="17"/>
         </w:rPr>
-        <w:t>[/] Fishing</w:t>
+        <w:t xml:space="preserve">[/] </w:t>
+      </w:r>
+      <w:r>
+        <w:rPr>
+          <w:rFonts w:ascii="Arial" w:hAnsi="Arial" w:cs="Arial"/>
+          <w:b/>
+          <w:bCs/>
+          <w:sz w:val="17"/>
+          <w:szCs w:val="17"/>
+        </w:rPr>
+        <w:t>Fishing</w:t>
       </w:r>
     </w:p>
     <w:p>
@@ -9499,7 +10342,17 @@
           <w:sz w:val="17"/>
           <w:szCs w:val="17"/>
         </w:rPr>
-        <w:t>[/] Mining and Quarrying</w:t>
+        <w:t xml:space="preserve">[/] </w:t>
+      </w:r>
+      <w:r>
+        <w:rPr>
+          <w:rFonts w:ascii="Arial" w:hAnsi="Arial" w:cs="Arial"/>
+          <w:b/>
+          <w:bCs/>
+          <w:sz w:val="17"/>
+          <w:szCs w:val="17"/>
+        </w:rPr>
+        <w:t>Mining and Quarrying</w:t>
       </w:r>
     </w:p>
     <w:p>
@@ -9602,7 +10455,17 @@
           <w:sz w:val="17"/>
           <w:szCs w:val="17"/>
         </w:rPr>
-        <w:t>[/] Manufacturing</w:t>
+        <w:t xml:space="preserve">[/] </w:t>
+      </w:r>
+      <w:r>
+        <w:rPr>
+          <w:rFonts w:ascii="Arial" w:hAnsi="Arial" w:cs="Arial"/>
+          <w:b/>
+          <w:bCs/>
+          <w:sz w:val="17"/>
+          <w:szCs w:val="17"/>
+        </w:rPr>
+        <w:t>Manufacturing</w:t>
       </w:r>
     </w:p>
     <w:p>
@@ -9705,7 +10568,17 @@
           <w:sz w:val="17"/>
           <w:szCs w:val="17"/>
         </w:rPr>
-        <w:t>[/] Electricity, Gas and Water Supply</w:t>
+        <w:t xml:space="preserve">[/] </w:t>
+      </w:r>
+      <w:r>
+        <w:rPr>
+          <w:rFonts w:ascii="Arial" w:hAnsi="Arial" w:cs="Arial"/>
+          <w:b/>
+          <w:bCs/>
+          <w:sz w:val="17"/>
+          <w:szCs w:val="17"/>
+        </w:rPr>
+        <w:t>Electricity, Gas and Water Supply</w:t>
       </w:r>
     </w:p>
     <w:p>
@@ -9808,7 +10681,17 @@
           <w:sz w:val="17"/>
           <w:szCs w:val="17"/>
         </w:rPr>
-        <w:t>[/] Construction</w:t>
+        <w:t xml:space="preserve">[/] </w:t>
+      </w:r>
+      <w:r>
+        <w:rPr>
+          <w:rFonts w:ascii="Arial" w:hAnsi="Arial" w:cs="Arial"/>
+          <w:b/>
+          <w:bCs/>
+          <w:sz w:val="17"/>
+          <w:szCs w:val="17"/>
+        </w:rPr>
+        <w:t>Construction</w:t>
       </w:r>
     </w:p>
     <w:p>
@@ -9911,7 +10794,17 @@
           <w:sz w:val="17"/>
           <w:szCs w:val="17"/>
         </w:rPr>
-        <w:t>[/] Wholesale and Retail Trade, Repair of Motor Vehicles, Motorcycles and Personal and Household Goods</w:t>
+        <w:t xml:space="preserve">[/] </w:t>
+      </w:r>
+      <w:r>
+        <w:rPr>
+          <w:rFonts w:ascii="Arial" w:hAnsi="Arial" w:cs="Arial"/>
+          <w:b/>
+          <w:bCs/>
+          <w:sz w:val="17"/>
+          <w:szCs w:val="17"/>
+        </w:rPr>
+        <w:t>Wholesale and Retail Trade, Repair of Motor Vehicles, Motorcycles and Personal and Household Goods</w:t>
       </w:r>
     </w:p>
     <w:p>
@@ -10014,7 +10907,17 @@
           <w:sz w:val="17"/>
           <w:szCs w:val="17"/>
         </w:rPr>
-        <w:t>[/] Hotels and Restaurants</w:t>
+        <w:t xml:space="preserve">[/] </w:t>
+      </w:r>
+      <w:r>
+        <w:rPr>
+          <w:rFonts w:ascii="Arial" w:hAnsi="Arial" w:cs="Arial"/>
+          <w:b/>
+          <w:bCs/>
+          <w:sz w:val="17"/>
+          <w:szCs w:val="17"/>
+        </w:rPr>
+        <w:t>Hotels and Restaurants</w:t>
       </w:r>
     </w:p>
     <w:p>
@@ -10117,7 +11020,17 @@
           <w:sz w:val="17"/>
           <w:szCs w:val="17"/>
         </w:rPr>
-        <w:t>[/] Transport, Storage and Communication</w:t>
+        <w:t xml:space="preserve">[/] </w:t>
+      </w:r>
+      <w:r>
+        <w:rPr>
+          <w:rFonts w:ascii="Arial" w:hAnsi="Arial" w:cs="Arial"/>
+          <w:b/>
+          <w:bCs/>
+          <w:sz w:val="17"/>
+          <w:szCs w:val="17"/>
+        </w:rPr>
+        <w:t>Transport, Storage and Communication</w:t>
       </w:r>
     </w:p>
     <w:p>
@@ -10220,7 +11133,17 @@
           <w:sz w:val="17"/>
           <w:szCs w:val="17"/>
         </w:rPr>
-        <w:t>[/] Financial Intermediation</w:t>
+        <w:t xml:space="preserve">[/] </w:t>
+      </w:r>
+      <w:r>
+        <w:rPr>
+          <w:rFonts w:ascii="Arial" w:hAnsi="Arial" w:cs="Arial"/>
+          <w:b/>
+          <w:bCs/>
+          <w:sz w:val="17"/>
+          <w:szCs w:val="17"/>
+        </w:rPr>
+        <w:t>Financial Intermediation</w:t>
       </w:r>
     </w:p>
     <w:p>
@@ -10323,7 +11246,17 @@
           <w:sz w:val="17"/>
           <w:szCs w:val="17"/>
         </w:rPr>
-        <w:t>[/] Real Estate, Renting and Business Activities</w:t>
+        <w:t xml:space="preserve">[/] </w:t>
+      </w:r>
+      <w:r>
+        <w:rPr>
+          <w:rFonts w:ascii="Arial" w:hAnsi="Arial" w:cs="Arial"/>
+          <w:b/>
+          <w:bCs/>
+          <w:sz w:val="17"/>
+          <w:szCs w:val="17"/>
+        </w:rPr>
+        <w:t>Real Estate, Renting and Business Activities</w:t>
       </w:r>
     </w:p>
     <w:p>
@@ -10416,17 +11349,29 @@
         <w:spacing w:after="0" w:line="240" w:lineRule="auto"/>
         <w:rPr>
           <w:rFonts w:ascii="Arial" w:hAnsi="Arial" w:cs="Arial"/>
-          <w:sz w:val="17"/>
-          <w:szCs w:val="17"/>
-        </w:rPr>
-      </w:pPr>
-      <w:r>
-        <w:rPr>
-          <w:rFonts w:ascii="Arial" w:hAnsi="Arial" w:cs="Arial"/>
-          <w:sz w:val="17"/>
-          <w:szCs w:val="17"/>
-        </w:rPr>
-        <w:t>[/] Public Administration and Defense; Compulsory Social Security</w:t>
+          <w:b/>
+          <w:bCs/>
+          <w:sz w:val="17"/>
+          <w:szCs w:val="17"/>
+        </w:rPr>
+      </w:pPr>
+      <w:r>
+        <w:rPr>
+          <w:rFonts w:ascii="Arial" w:hAnsi="Arial" w:cs="Arial"/>
+          <w:sz w:val="17"/>
+          <w:szCs w:val="17"/>
+        </w:rPr>
+        <w:t xml:space="preserve">[/] </w:t>
+      </w:r>
+      <w:r>
+        <w:rPr>
+          <w:rFonts w:ascii="Arial" w:hAnsi="Arial" w:cs="Arial"/>
+          <w:b/>
+          <w:bCs/>
+          <w:sz w:val="17"/>
+          <w:szCs w:val="17"/>
+        </w:rPr>
+        <w:t>Public Administration and Defense; Compulsory Social Security</w:t>
       </w:r>
     </w:p>
     <w:p>
@@ -10529,7 +11474,17 @@
           <w:sz w:val="17"/>
           <w:szCs w:val="17"/>
         </w:rPr>
-        <w:t>[/] Education</w:t>
+        <w:t xml:space="preserve">[/] </w:t>
+      </w:r>
+      <w:r>
+        <w:rPr>
+          <w:rFonts w:ascii="Arial" w:hAnsi="Arial" w:cs="Arial"/>
+          <w:b/>
+          <w:bCs/>
+          <w:sz w:val="17"/>
+          <w:szCs w:val="17"/>
+        </w:rPr>
+        <w:t>Education</w:t>
       </w:r>
     </w:p>
     <w:p>
@@ -10632,7 +11587,17 @@
           <w:sz w:val="17"/>
           <w:szCs w:val="17"/>
         </w:rPr>
-        <w:t>[/] Health and Social Work</w:t>
+        <w:t xml:space="preserve">[/] </w:t>
+      </w:r>
+      <w:r>
+        <w:rPr>
+          <w:rFonts w:ascii="Arial" w:hAnsi="Arial" w:cs="Arial"/>
+          <w:b/>
+          <w:bCs/>
+          <w:sz w:val="17"/>
+          <w:szCs w:val="17"/>
+        </w:rPr>
+        <w:t>Health and Social Work</w:t>
       </w:r>
     </w:p>
     <w:p>
@@ -10735,7 +11700,17 @@
           <w:sz w:val="17"/>
           <w:szCs w:val="17"/>
         </w:rPr>
-        <w:t>[/] Other Community, Social and Personal Service Activities</w:t>
+        <w:t xml:space="preserve">[/] </w:t>
+      </w:r>
+      <w:r>
+        <w:rPr>
+          <w:rFonts w:ascii="Arial" w:hAnsi="Arial" w:cs="Arial"/>
+          <w:b/>
+          <w:bCs/>
+          <w:sz w:val="17"/>
+          <w:szCs w:val="17"/>
+        </w:rPr>
+        <w:t>Other Community, Social and Personal Service Activities</w:t>
       </w:r>
     </w:p>
     <w:p>
@@ -10838,26 +11813,36 @@
           <w:sz w:val="17"/>
           <w:szCs w:val="17"/>
         </w:rPr>
-        <w:t>[/] Private Households with Employed Persons</w:t>
-      </w:r>
-    </w:p>
-    <w:p>
-      <w:pPr>
-        <w:pStyle w:val="ListParagraph"/>
-        <w:spacing w:after="0" w:line="240" w:lineRule="auto"/>
-        <w:rPr>
-          <w:rFonts w:ascii="Arial" w:hAnsi="Arial" w:cs="Arial"/>
-          <w:sz w:val="17"/>
-          <w:szCs w:val="17"/>
-        </w:rPr>
-      </w:pPr>
-      <w:r>
-        <w:rPr>
-          <w:rFonts w:ascii="Arial" w:hAnsi="Arial" w:cs="Arial"/>
-          <w:sz w:val="17"/>
-          <w:szCs w:val="17"/>
-        </w:rPr>
         <w:lastRenderedPageBreak/>
+        <w:t xml:space="preserve">[/] </w:t>
+      </w:r>
+      <w:r>
+        <w:rPr>
+          <w:rFonts w:ascii="Arial" w:hAnsi="Arial" w:cs="Arial"/>
+          <w:b/>
+          <w:bCs/>
+          <w:sz w:val="17"/>
+          <w:szCs w:val="17"/>
+        </w:rPr>
+        <w:t>Private Households with Employed Persons</w:t>
+      </w:r>
+    </w:p>
+    <w:p>
+      <w:pPr>
+        <w:pStyle w:val="ListParagraph"/>
+        <w:spacing w:after="0" w:line="240" w:lineRule="auto"/>
+        <w:rPr>
+          <w:rFonts w:ascii="Arial" w:hAnsi="Arial" w:cs="Arial"/>
+          <w:sz w:val="17"/>
+          <w:szCs w:val="17"/>
+        </w:rPr>
+      </w:pPr>
+      <w:r>
+        <w:rPr>
+          <w:rFonts w:ascii="Arial" w:hAnsi="Arial" w:cs="Arial"/>
+          <w:sz w:val="17"/>
+          <w:szCs w:val="17"/>
+        </w:rPr>
         <w:t>{/</w:t>
       </w:r>
       <w:proofErr w:type="spellStart"/>
@@ -10942,7 +11927,17 @@
           <w:sz w:val="17"/>
           <w:szCs w:val="17"/>
         </w:rPr>
-        <w:t>[/] Extra-territorial Organizations and Bodies</w:t>
+        <w:t xml:space="preserve">[/] </w:t>
+      </w:r>
+      <w:r>
+        <w:rPr>
+          <w:rFonts w:ascii="Arial" w:hAnsi="Arial" w:cs="Arial"/>
+          <w:b/>
+          <w:bCs/>
+          <w:sz w:val="17"/>
+          <w:szCs w:val="17"/>
+        </w:rPr>
+        <w:t>Extra-territorial Organizations and Bodies</w:t>
       </w:r>
     </w:p>
     <w:p>
@@ -11100,7 +12095,25 @@
           <w:sz w:val="17"/>
           <w:szCs w:val="17"/>
         </w:rPr>
-        <w:t>/] Local{/</w:t>
+        <w:t xml:space="preserve">/] </w:t>
+      </w:r>
+      <w:r>
+        <w:rPr>
+          <w:rFonts w:ascii="Arial" w:hAnsi="Arial" w:cs="Arial"/>
+          <w:b/>
+          <w:bCs/>
+          <w:sz w:val="17"/>
+          <w:szCs w:val="17"/>
+        </w:rPr>
+        <w:t>Local</w:t>
+      </w:r>
+      <w:r>
+        <w:rPr>
+          <w:rFonts w:ascii="Arial" w:hAnsi="Arial" w:cs="Arial"/>
+          <w:sz w:val="17"/>
+          <w:szCs w:val="17"/>
+        </w:rPr>
+        <w:t>{/</w:t>
       </w:r>
       <w:proofErr w:type="spellStart"/>
       <w:proofErr w:type="gramStart"/>
@@ -11182,7 +12195,25 @@
           <w:sz w:val="17"/>
           <w:szCs w:val="17"/>
         </w:rPr>
-        <w:t>/] Abroad{/</w:t>
+        <w:t xml:space="preserve">/] </w:t>
+      </w:r>
+      <w:r>
+        <w:rPr>
+          <w:rFonts w:ascii="Arial" w:hAnsi="Arial" w:cs="Arial"/>
+          <w:b/>
+          <w:bCs/>
+          <w:sz w:val="17"/>
+          <w:szCs w:val="17"/>
+        </w:rPr>
+        <w:t>Abroad</w:t>
+      </w:r>
+      <w:r>
+        <w:rPr>
+          <w:rFonts w:ascii="Arial" w:hAnsi="Arial" w:cs="Arial"/>
+          <w:sz w:val="17"/>
+          <w:szCs w:val="17"/>
+        </w:rPr>
+        <w:t>{/</w:t>
       </w:r>
       <w:proofErr w:type="spellStart"/>
       <w:proofErr w:type="gramStart"/>
@@ -11314,7 +12345,25 @@
           <w:sz w:val="17"/>
           <w:szCs w:val="17"/>
         </w:rPr>
-        <w:t>/] Yes{/</w:t>
+        <w:t xml:space="preserve">/] </w:t>
+      </w:r>
+      <w:r>
+        <w:rPr>
+          <w:rFonts w:ascii="Arial" w:hAnsi="Arial" w:cs="Arial"/>
+          <w:b/>
+          <w:bCs/>
+          <w:sz w:val="17"/>
+          <w:szCs w:val="17"/>
+        </w:rPr>
+        <w:t>Yes</w:t>
+      </w:r>
+      <w:r>
+        <w:rPr>
+          <w:rFonts w:ascii="Arial" w:hAnsi="Arial" w:cs="Arial"/>
+          <w:sz w:val="17"/>
+          <w:szCs w:val="17"/>
+        </w:rPr>
+        <w:t>{/</w:t>
       </w:r>
       <w:proofErr w:type="spellStart"/>
       <w:proofErr w:type="gramStart"/>
@@ -11396,7 +12445,25 @@
           <w:sz w:val="17"/>
           <w:szCs w:val="17"/>
         </w:rPr>
-        <w:t>/] No{/</w:t>
+        <w:t xml:space="preserve">/] </w:t>
+      </w:r>
+      <w:r>
+        <w:rPr>
+          <w:rFonts w:ascii="Arial" w:hAnsi="Arial" w:cs="Arial"/>
+          <w:b/>
+          <w:bCs/>
+          <w:sz w:val="17"/>
+          <w:szCs w:val="17"/>
+        </w:rPr>
+        <w:t>No</w:t>
+      </w:r>
+      <w:r>
+        <w:rPr>
+          <w:rFonts w:ascii="Arial" w:hAnsi="Arial" w:cs="Arial"/>
+          <w:sz w:val="17"/>
+          <w:szCs w:val="17"/>
+        </w:rPr>
+        <w:t>{/</w:t>
       </w:r>
       <w:proofErr w:type="spellStart"/>
       <w:proofErr w:type="gramStart"/>
@@ -11540,17 +12607,29 @@
         <w:spacing w:after="0" w:line="240" w:lineRule="auto"/>
         <w:rPr>
           <w:rFonts w:ascii="Arial" w:hAnsi="Arial" w:cs="Arial"/>
-          <w:sz w:val="17"/>
-          <w:szCs w:val="17"/>
-        </w:rPr>
-      </w:pPr>
-      <w:r>
-        <w:rPr>
-          <w:rFonts w:ascii="Arial" w:hAnsi="Arial" w:cs="Arial"/>
-          <w:sz w:val="17"/>
-          <w:szCs w:val="17"/>
-        </w:rPr>
-        <w:t>[/] Salaries and benefits</w:t>
+          <w:b/>
+          <w:bCs/>
+          <w:sz w:val="17"/>
+          <w:szCs w:val="17"/>
+        </w:rPr>
+      </w:pPr>
+      <w:r>
+        <w:rPr>
+          <w:rFonts w:ascii="Arial" w:hAnsi="Arial" w:cs="Arial"/>
+          <w:sz w:val="17"/>
+          <w:szCs w:val="17"/>
+        </w:rPr>
+        <w:t xml:space="preserve">[/] </w:t>
+      </w:r>
+      <w:r>
+        <w:rPr>
+          <w:rFonts w:ascii="Arial" w:hAnsi="Arial" w:cs="Arial"/>
+          <w:b/>
+          <w:bCs/>
+          <w:sz w:val="17"/>
+          <w:szCs w:val="17"/>
+        </w:rPr>
+        <w:t>Salaries and benefits</w:t>
       </w:r>
     </w:p>
     <w:p>
@@ -11653,7 +12732,17 @@
           <w:sz w:val="17"/>
           <w:szCs w:val="17"/>
         </w:rPr>
-        <w:t>[/] Career challenge</w:t>
+        <w:t xml:space="preserve">[/] </w:t>
+      </w:r>
+      <w:r>
+        <w:rPr>
+          <w:rFonts w:ascii="Arial" w:hAnsi="Arial" w:cs="Arial"/>
+          <w:b/>
+          <w:bCs/>
+          <w:sz w:val="17"/>
+          <w:szCs w:val="17"/>
+        </w:rPr>
+        <w:t>Career challenge</w:t>
       </w:r>
     </w:p>
     <w:p>
@@ -11756,7 +12845,17 @@
           <w:sz w:val="17"/>
           <w:szCs w:val="17"/>
         </w:rPr>
-        <w:t>[/] Related to special skill</w:t>
+        <w:t xml:space="preserve">[/] </w:t>
+      </w:r>
+      <w:r>
+        <w:rPr>
+          <w:rFonts w:ascii="Arial" w:hAnsi="Arial" w:cs="Arial"/>
+          <w:b/>
+          <w:bCs/>
+          <w:sz w:val="17"/>
+          <w:szCs w:val="17"/>
+        </w:rPr>
+        <w:t>Related to special skill</w:t>
       </w:r>
     </w:p>
     <w:p>
@@ -11859,7 +12958,17 @@
           <w:sz w:val="17"/>
           <w:szCs w:val="17"/>
         </w:rPr>
-        <w:t>[/] Related to course or program of study</w:t>
+        <w:t xml:space="preserve">[/] </w:t>
+      </w:r>
+      <w:r>
+        <w:rPr>
+          <w:rFonts w:ascii="Arial" w:hAnsi="Arial" w:cs="Arial"/>
+          <w:b/>
+          <w:bCs/>
+          <w:sz w:val="17"/>
+          <w:szCs w:val="17"/>
+        </w:rPr>
+        <w:t>Related to course or program of study</w:t>
       </w:r>
     </w:p>
     <w:p>
@@ -11962,7 +13071,17 @@
           <w:sz w:val="17"/>
           <w:szCs w:val="17"/>
         </w:rPr>
-        <w:t>[/] Proximity to residence</w:t>
+        <w:t xml:space="preserve">[/] </w:t>
+      </w:r>
+      <w:r>
+        <w:rPr>
+          <w:rFonts w:ascii="Arial" w:hAnsi="Arial" w:cs="Arial"/>
+          <w:b/>
+          <w:bCs/>
+          <w:sz w:val="17"/>
+          <w:szCs w:val="17"/>
+        </w:rPr>
+        <w:t>Proximity to residence</w:t>
       </w:r>
     </w:p>
     <w:p>
@@ -12065,7 +13184,17 @@
           <w:sz w:val="17"/>
           <w:szCs w:val="17"/>
         </w:rPr>
-        <w:t>[/] Peer influence</w:t>
+        <w:t xml:space="preserve">[/] </w:t>
+      </w:r>
+      <w:r>
+        <w:rPr>
+          <w:rFonts w:ascii="Arial" w:hAnsi="Arial" w:cs="Arial"/>
+          <w:b/>
+          <w:bCs/>
+          <w:sz w:val="17"/>
+          <w:szCs w:val="17"/>
+        </w:rPr>
+        <w:t>Peer influence</w:t>
       </w:r>
     </w:p>
     <w:p>
@@ -12168,7 +13297,17 @@
           <w:sz w:val="17"/>
           <w:szCs w:val="17"/>
         </w:rPr>
-        <w:t>[/] Family influence</w:t>
+        <w:t xml:space="preserve">[/] </w:t>
+      </w:r>
+      <w:r>
+        <w:rPr>
+          <w:rFonts w:ascii="Arial" w:hAnsi="Arial" w:cs="Arial"/>
+          <w:b/>
+          <w:bCs/>
+          <w:sz w:val="17"/>
+          <w:szCs w:val="17"/>
+        </w:rPr>
+        <w:t>Family influence</w:t>
       </w:r>
     </w:p>
     <w:p>
@@ -12271,12 +13410,24 @@
           <w:sz w:val="17"/>
           <w:szCs w:val="17"/>
         </w:rPr>
-        <w:t>[/] Other reason(s), please specify: {</w:t>
+        <w:t xml:space="preserve">[/] Other reason(s), please specify: </w:t>
+      </w:r>
+      <w:r>
+        <w:rPr>
+          <w:rFonts w:ascii="Arial" w:hAnsi="Arial" w:cs="Arial"/>
+          <w:b/>
+          <w:bCs/>
+          <w:sz w:val="17"/>
+          <w:szCs w:val="17"/>
+        </w:rPr>
+        <w:t>{</w:t>
       </w:r>
       <w:proofErr w:type="spellStart"/>
       <w:r>
         <w:rPr>
           <w:rFonts w:ascii="Arial" w:hAnsi="Arial" w:cs="Arial"/>
+          <w:b/>
+          <w:bCs/>
           <w:sz w:val="17"/>
           <w:szCs w:val="17"/>
         </w:rPr>
@@ -12286,6 +13437,8 @@
       <w:r>
         <w:rPr>
           <w:rFonts w:ascii="Arial" w:hAnsi="Arial" w:cs="Arial"/>
+          <w:b/>
+          <w:bCs/>
           <w:sz w:val="17"/>
           <w:szCs w:val="17"/>
         </w:rPr>
@@ -12425,7 +13578,25 @@
           <w:sz w:val="17"/>
           <w:szCs w:val="17"/>
         </w:rPr>
-        <w:t>/] Yes{/</w:t>
+        <w:t xml:space="preserve">/] </w:t>
+      </w:r>
+      <w:r>
+        <w:rPr>
+          <w:rFonts w:ascii="Arial" w:hAnsi="Arial" w:cs="Arial"/>
+          <w:b/>
+          <w:bCs/>
+          <w:sz w:val="17"/>
+          <w:szCs w:val="17"/>
+        </w:rPr>
+        <w:t>Yes</w:t>
+      </w:r>
+      <w:r>
+        <w:rPr>
+          <w:rFonts w:ascii="Arial" w:hAnsi="Arial" w:cs="Arial"/>
+          <w:sz w:val="17"/>
+          <w:szCs w:val="17"/>
+        </w:rPr>
+        <w:t>{/</w:t>
       </w:r>
       <w:proofErr w:type="gramStart"/>
       <w:r>
@@ -12497,7 +13668,25 @@
           <w:sz w:val="17"/>
           <w:szCs w:val="17"/>
         </w:rPr>
-        <w:t>/] No{/</w:t>
+        <w:t xml:space="preserve">/] </w:t>
+      </w:r>
+      <w:r>
+        <w:rPr>
+          <w:rFonts w:ascii="Arial" w:hAnsi="Arial" w:cs="Arial"/>
+          <w:b/>
+          <w:bCs/>
+          <w:sz w:val="17"/>
+          <w:szCs w:val="17"/>
+        </w:rPr>
+        <w:t>No</w:t>
+      </w:r>
+      <w:r>
+        <w:rPr>
+          <w:rFonts w:ascii="Arial" w:hAnsi="Arial" w:cs="Arial"/>
+          <w:sz w:val="17"/>
+          <w:szCs w:val="17"/>
+        </w:rPr>
+        <w:t>{/</w:t>
       </w:r>
       <w:proofErr w:type="spellStart"/>
       <w:proofErr w:type="gramStart"/>
@@ -12674,7 +13863,17 @@
           <w:sz w:val="17"/>
           <w:szCs w:val="17"/>
         </w:rPr>
-        <w:t>[/] Salaries &amp; benefits</w:t>
+        <w:t xml:space="preserve">[/] </w:t>
+      </w:r>
+      <w:r>
+        <w:rPr>
+          <w:rFonts w:ascii="Arial" w:hAnsi="Arial" w:cs="Arial"/>
+          <w:b/>
+          <w:bCs/>
+          <w:sz w:val="17"/>
+          <w:szCs w:val="17"/>
+        </w:rPr>
+        <w:t>Salaries &amp; benefits</w:t>
       </w:r>
     </w:p>
     <w:p>
@@ -12777,7 +13976,17 @@
           <w:sz w:val="17"/>
           <w:szCs w:val="17"/>
         </w:rPr>
-        <w:t>[/] Career challenge</w:t>
+        <w:t xml:space="preserve">[/] </w:t>
+      </w:r>
+      <w:r>
+        <w:rPr>
+          <w:rFonts w:ascii="Arial" w:hAnsi="Arial" w:cs="Arial"/>
+          <w:b/>
+          <w:bCs/>
+          <w:sz w:val="17"/>
+          <w:szCs w:val="17"/>
+        </w:rPr>
+        <w:t>Career challenge</w:t>
       </w:r>
     </w:p>
     <w:p>
@@ -12880,7 +14089,17 @@
           <w:sz w:val="17"/>
           <w:szCs w:val="17"/>
         </w:rPr>
-        <w:t>[/] Related to special skills</w:t>
+        <w:t xml:space="preserve">[/] </w:t>
+      </w:r>
+      <w:r>
+        <w:rPr>
+          <w:rFonts w:ascii="Arial" w:hAnsi="Arial" w:cs="Arial"/>
+          <w:b/>
+          <w:bCs/>
+          <w:sz w:val="17"/>
+          <w:szCs w:val="17"/>
+        </w:rPr>
+        <w:t>Related to special skills</w:t>
       </w:r>
     </w:p>
     <w:p>
@@ -12983,7 +14202,17 @@
           <w:sz w:val="17"/>
           <w:szCs w:val="17"/>
         </w:rPr>
-        <w:t>[/] Proximity to residence</w:t>
+        <w:t xml:space="preserve">[/] </w:t>
+      </w:r>
+      <w:r>
+        <w:rPr>
+          <w:rFonts w:ascii="Arial" w:hAnsi="Arial" w:cs="Arial"/>
+          <w:b/>
+          <w:bCs/>
+          <w:sz w:val="17"/>
+          <w:szCs w:val="17"/>
+        </w:rPr>
+        <w:t>Proximity to residence</w:t>
       </w:r>
     </w:p>
     <w:p>
@@ -13086,12 +14315,24 @@
           <w:sz w:val="17"/>
           <w:szCs w:val="17"/>
         </w:rPr>
-        <w:t>[/] Other reason(s), please specify: {</w:t>
+        <w:t xml:space="preserve">[/] Other reason(s), please specify: </w:t>
+      </w:r>
+      <w:r>
+        <w:rPr>
+          <w:rFonts w:ascii="Arial" w:hAnsi="Arial" w:cs="Arial"/>
+          <w:b/>
+          <w:bCs/>
+          <w:sz w:val="17"/>
+          <w:szCs w:val="17"/>
+        </w:rPr>
+        <w:t>{</w:t>
       </w:r>
       <w:proofErr w:type="spellStart"/>
       <w:r>
         <w:rPr>
           <w:rFonts w:ascii="Arial" w:hAnsi="Arial" w:cs="Arial"/>
+          <w:b/>
+          <w:bCs/>
           <w:sz w:val="17"/>
           <w:szCs w:val="17"/>
         </w:rPr>
@@ -13101,6 +14342,8 @@
       <w:r>
         <w:rPr>
           <w:rFonts w:ascii="Arial" w:hAnsi="Arial" w:cs="Arial"/>
+          <w:b/>
+          <w:bCs/>
           <w:sz w:val="17"/>
           <w:szCs w:val="17"/>
         </w:rPr>
@@ -13240,7 +14483,17 @@
           <w:sz w:val="17"/>
           <w:szCs w:val="17"/>
         </w:rPr>
-        <w:t>[/] Salaries &amp; benefits</w:t>
+        <w:t xml:space="preserve">[/] </w:t>
+      </w:r>
+      <w:r>
+        <w:rPr>
+          <w:rFonts w:ascii="Arial" w:hAnsi="Arial" w:cs="Arial"/>
+          <w:b/>
+          <w:bCs/>
+          <w:sz w:val="17"/>
+          <w:szCs w:val="17"/>
+        </w:rPr>
+        <w:t>Salaries &amp; benefits</w:t>
       </w:r>
     </w:p>
     <w:p>
@@ -13343,7 +14596,17 @@
           <w:sz w:val="17"/>
           <w:szCs w:val="17"/>
         </w:rPr>
-        <w:t>[/] Career challenge</w:t>
+        <w:t xml:space="preserve">[/] </w:t>
+      </w:r>
+      <w:r>
+        <w:rPr>
+          <w:rFonts w:ascii="Arial" w:hAnsi="Arial" w:cs="Arial"/>
+          <w:b/>
+          <w:bCs/>
+          <w:sz w:val="17"/>
+          <w:szCs w:val="17"/>
+        </w:rPr>
+        <w:t>Career challenge</w:t>
       </w:r>
     </w:p>
     <w:p>
@@ -13409,6 +14672,7 @@
           <w:sz w:val="17"/>
           <w:szCs w:val="17"/>
         </w:rPr>
+        <w:lastRenderedPageBreak/>
         <w:t>{#</w:t>
       </w:r>
       <w:proofErr w:type="gramStart"/>
@@ -13446,8 +14710,17 @@
           <w:sz w:val="17"/>
           <w:szCs w:val="17"/>
         </w:rPr>
-        <w:lastRenderedPageBreak/>
-        <w:t>[/] Related to special skills</w:t>
+        <w:t xml:space="preserve">[/] </w:t>
+      </w:r>
+      <w:r>
+        <w:rPr>
+          <w:rFonts w:ascii="Arial" w:hAnsi="Arial" w:cs="Arial"/>
+          <w:b/>
+          <w:bCs/>
+          <w:sz w:val="17"/>
+          <w:szCs w:val="17"/>
+        </w:rPr>
+        <w:t>Related to special skills</w:t>
       </w:r>
     </w:p>
     <w:p>
@@ -13550,7 +14823,17 @@
           <w:sz w:val="17"/>
           <w:szCs w:val="17"/>
         </w:rPr>
-        <w:t>[/] Proximity to residence</w:t>
+        <w:t xml:space="preserve">[/] </w:t>
+      </w:r>
+      <w:r>
+        <w:rPr>
+          <w:rFonts w:ascii="Arial" w:hAnsi="Arial" w:cs="Arial"/>
+          <w:b/>
+          <w:bCs/>
+          <w:sz w:val="17"/>
+          <w:szCs w:val="17"/>
+        </w:rPr>
+        <w:t>Proximity to residence</w:t>
       </w:r>
     </w:p>
     <w:p>
@@ -13653,12 +14936,24 @@
           <w:sz w:val="17"/>
           <w:szCs w:val="17"/>
         </w:rPr>
-        <w:t>[/] Other reason(s), please specify: {</w:t>
+        <w:t xml:space="preserve">[/] Other reason(s), please specify: </w:t>
+      </w:r>
+      <w:r>
+        <w:rPr>
+          <w:rFonts w:ascii="Arial" w:hAnsi="Arial" w:cs="Arial"/>
+          <w:b/>
+          <w:bCs/>
+          <w:sz w:val="17"/>
+          <w:szCs w:val="17"/>
+        </w:rPr>
+        <w:t>{</w:t>
       </w:r>
       <w:proofErr w:type="spellStart"/>
       <w:r>
         <w:rPr>
           <w:rFonts w:ascii="Arial" w:hAnsi="Arial" w:cs="Arial"/>
+          <w:b/>
+          <w:bCs/>
           <w:sz w:val="17"/>
           <w:szCs w:val="17"/>
         </w:rPr>
@@ -13668,6 +14963,8 @@
       <w:r>
         <w:rPr>
           <w:rFonts w:ascii="Arial" w:hAnsi="Arial" w:cs="Arial"/>
+          <w:b/>
+          <w:bCs/>
           <w:sz w:val="17"/>
           <w:szCs w:val="17"/>
         </w:rPr>
@@ -13808,7 +15105,17 @@
           <w:sz w:val="17"/>
           <w:szCs w:val="17"/>
         </w:rPr>
-        <w:t>[/] Less than a month</w:t>
+        <w:t xml:space="preserve">[/] </w:t>
+      </w:r>
+      <w:r>
+        <w:rPr>
+          <w:rFonts w:ascii="Arial" w:hAnsi="Arial" w:cs="Arial"/>
+          <w:b/>
+          <w:bCs/>
+          <w:sz w:val="17"/>
+          <w:szCs w:val="17"/>
+        </w:rPr>
+        <w:t>Less than a month</w:t>
       </w:r>
     </w:p>
     <w:p>
@@ -13911,7 +15218,17 @@
           <w:sz w:val="17"/>
           <w:szCs w:val="17"/>
         </w:rPr>
-        <w:t>[/] 1 to 6 months</w:t>
+        <w:t xml:space="preserve">[/] </w:t>
+      </w:r>
+      <w:r>
+        <w:rPr>
+          <w:rFonts w:ascii="Arial" w:hAnsi="Arial" w:cs="Arial"/>
+          <w:b/>
+          <w:bCs/>
+          <w:sz w:val="17"/>
+          <w:szCs w:val="17"/>
+        </w:rPr>
+        <w:t>1 to 6 months</w:t>
       </w:r>
     </w:p>
     <w:p>
@@ -14004,7 +15321,17 @@
           <w:sz w:val="17"/>
           <w:szCs w:val="17"/>
         </w:rPr>
-        <w:t>[/] 7 to 11 months</w:t>
+        <w:t xml:space="preserve">[/] </w:t>
+      </w:r>
+      <w:r>
+        <w:rPr>
+          <w:rFonts w:ascii="Arial" w:hAnsi="Arial" w:cs="Arial"/>
+          <w:b/>
+          <w:bCs/>
+          <w:sz w:val="17"/>
+          <w:szCs w:val="17"/>
+        </w:rPr>
+        <w:t>7 to 11 months</w:t>
       </w:r>
     </w:p>
     <w:p>
@@ -14097,7 +15424,17 @@
           <w:sz w:val="17"/>
           <w:szCs w:val="17"/>
         </w:rPr>
-        <w:t>[/] 1 year to less than 2 years</w:t>
+        <w:t xml:space="preserve">[/] </w:t>
+      </w:r>
+      <w:r>
+        <w:rPr>
+          <w:rFonts w:ascii="Arial" w:hAnsi="Arial" w:cs="Arial"/>
+          <w:b/>
+          <w:bCs/>
+          <w:sz w:val="17"/>
+          <w:szCs w:val="17"/>
+        </w:rPr>
+        <w:t>1 year to less than 2 years</w:t>
       </w:r>
     </w:p>
     <w:p>
@@ -14190,7 +15527,17 @@
           <w:sz w:val="17"/>
           <w:szCs w:val="17"/>
         </w:rPr>
-        <w:t>[/] 2 years to less than 3 years</w:t>
+        <w:t xml:space="preserve">[/] </w:t>
+      </w:r>
+      <w:r>
+        <w:rPr>
+          <w:rFonts w:ascii="Arial" w:hAnsi="Arial" w:cs="Arial"/>
+          <w:b/>
+          <w:bCs/>
+          <w:sz w:val="17"/>
+          <w:szCs w:val="17"/>
+        </w:rPr>
+        <w:t>2 years to less than 3 years</w:t>
       </w:r>
     </w:p>
     <w:p>
@@ -14283,7 +15630,17 @@
           <w:sz w:val="17"/>
           <w:szCs w:val="17"/>
         </w:rPr>
-        <w:t>[/] 3 years to less than 4 years</w:t>
+        <w:t xml:space="preserve">[/] </w:t>
+      </w:r>
+      <w:r>
+        <w:rPr>
+          <w:rFonts w:ascii="Arial" w:hAnsi="Arial" w:cs="Arial"/>
+          <w:b/>
+          <w:bCs/>
+          <w:sz w:val="17"/>
+          <w:szCs w:val="17"/>
+        </w:rPr>
+        <w:t>3 years to less than 4 years</w:t>
       </w:r>
     </w:p>
     <w:p>
@@ -14376,12 +15733,24 @@
           <w:sz w:val="17"/>
           <w:szCs w:val="17"/>
         </w:rPr>
-        <w:t>[/] Others, please specify: {</w:t>
+        <w:t>[/] Others, please specify:</w:t>
+      </w:r>
+      <w:r>
+        <w:rPr>
+          <w:rFonts w:ascii="Arial" w:hAnsi="Arial" w:cs="Arial"/>
+          <w:b/>
+          <w:bCs/>
+          <w:sz w:val="17"/>
+          <w:szCs w:val="17"/>
+        </w:rPr>
+        <w:t xml:space="preserve"> {</w:t>
       </w:r>
       <w:proofErr w:type="spellStart"/>
       <w:r>
         <w:rPr>
           <w:rFonts w:ascii="Arial" w:hAnsi="Arial" w:cs="Arial"/>
+          <w:b/>
+          <w:bCs/>
           <w:sz w:val="17"/>
           <w:szCs w:val="17"/>
         </w:rPr>
@@ -14391,6 +15760,8 @@
       <w:r>
         <w:rPr>
           <w:rFonts w:ascii="Arial" w:hAnsi="Arial" w:cs="Arial"/>
+          <w:b/>
+          <w:bCs/>
           <w:sz w:val="17"/>
           <w:szCs w:val="17"/>
         </w:rPr>
@@ -14531,7 +15902,17 @@
           <w:sz w:val="17"/>
           <w:szCs w:val="17"/>
         </w:rPr>
-        <w:t>[/] Response to an advertisement</w:t>
+        <w:t xml:space="preserve">[/] </w:t>
+      </w:r>
+      <w:r>
+        <w:rPr>
+          <w:rFonts w:ascii="Arial" w:hAnsi="Arial" w:cs="Arial"/>
+          <w:b/>
+          <w:bCs/>
+          <w:sz w:val="17"/>
+          <w:szCs w:val="17"/>
+        </w:rPr>
+        <w:t>Response to an advertisement</w:t>
       </w:r>
     </w:p>
     <w:p>
@@ -14624,17 +16005,29 @@
         <w:ind w:left="720"/>
         <w:rPr>
           <w:rFonts w:ascii="Arial" w:hAnsi="Arial" w:cs="Arial"/>
-          <w:sz w:val="17"/>
-          <w:szCs w:val="17"/>
-        </w:rPr>
-      </w:pPr>
-      <w:r>
-        <w:rPr>
-          <w:rFonts w:ascii="Arial" w:hAnsi="Arial" w:cs="Arial"/>
-          <w:sz w:val="17"/>
-          <w:szCs w:val="17"/>
-        </w:rPr>
-        <w:t>[/] As walk-in applicant</w:t>
+          <w:b/>
+          <w:bCs/>
+          <w:sz w:val="17"/>
+          <w:szCs w:val="17"/>
+        </w:rPr>
+      </w:pPr>
+      <w:r>
+        <w:rPr>
+          <w:rFonts w:ascii="Arial" w:hAnsi="Arial" w:cs="Arial"/>
+          <w:sz w:val="17"/>
+          <w:szCs w:val="17"/>
+        </w:rPr>
+        <w:t xml:space="preserve">[/] </w:t>
+      </w:r>
+      <w:r>
+        <w:rPr>
+          <w:rFonts w:ascii="Arial" w:hAnsi="Arial" w:cs="Arial"/>
+          <w:b/>
+          <w:bCs/>
+          <w:sz w:val="17"/>
+          <w:szCs w:val="17"/>
+        </w:rPr>
+        <w:t>As walk-in applicant</w:t>
       </w:r>
     </w:p>
     <w:p>
@@ -14737,7 +16130,17 @@
           <w:sz w:val="17"/>
           <w:szCs w:val="17"/>
         </w:rPr>
-        <w:t>[/] Recommended by someone</w:t>
+        <w:t xml:space="preserve">[/] </w:t>
+      </w:r>
+      <w:r>
+        <w:rPr>
+          <w:rFonts w:ascii="Arial" w:hAnsi="Arial" w:cs="Arial"/>
+          <w:b/>
+          <w:bCs/>
+          <w:sz w:val="17"/>
+          <w:szCs w:val="17"/>
+        </w:rPr>
+        <w:t>Recommended by someone</w:t>
       </w:r>
     </w:p>
     <w:p>
@@ -14840,7 +16243,17 @@
           <w:sz w:val="17"/>
           <w:szCs w:val="17"/>
         </w:rPr>
-        <w:t>[/] Information from friends</w:t>
+        <w:t xml:space="preserve">[/] </w:t>
+      </w:r>
+      <w:r>
+        <w:rPr>
+          <w:rFonts w:ascii="Arial" w:hAnsi="Arial" w:cs="Arial"/>
+          <w:b/>
+          <w:bCs/>
+          <w:sz w:val="17"/>
+          <w:szCs w:val="17"/>
+        </w:rPr>
+        <w:t>Information from friends</w:t>
       </w:r>
     </w:p>
     <w:p>
@@ -14943,7 +16356,17 @@
           <w:sz w:val="17"/>
           <w:szCs w:val="17"/>
         </w:rPr>
-        <w:t>[/] Arranged by school's job placement officer</w:t>
+        <w:t xml:space="preserve">[/] </w:t>
+      </w:r>
+      <w:r>
+        <w:rPr>
+          <w:rFonts w:ascii="Arial" w:hAnsi="Arial" w:cs="Arial"/>
+          <w:b/>
+          <w:bCs/>
+          <w:sz w:val="17"/>
+          <w:szCs w:val="17"/>
+        </w:rPr>
+        <w:t>Arranged by school's job placement officer</w:t>
       </w:r>
     </w:p>
     <w:p>
@@ -15046,7 +16469,17 @@
           <w:sz w:val="17"/>
           <w:szCs w:val="17"/>
         </w:rPr>
-        <w:t>[/] Family business</w:t>
+        <w:t xml:space="preserve">[/] </w:t>
+      </w:r>
+      <w:r>
+        <w:rPr>
+          <w:rFonts w:ascii="Arial" w:hAnsi="Arial" w:cs="Arial"/>
+          <w:b/>
+          <w:bCs/>
+          <w:sz w:val="17"/>
+          <w:szCs w:val="17"/>
+        </w:rPr>
+        <w:t>Family business</w:t>
       </w:r>
     </w:p>
     <w:p>
@@ -15149,7 +16582,17 @@
           <w:sz w:val="17"/>
           <w:szCs w:val="17"/>
         </w:rPr>
-        <w:t>[/] Job Fair or Public Employment Service Office (PESO)</w:t>
+        <w:t xml:space="preserve">[/] </w:t>
+      </w:r>
+      <w:r>
+        <w:rPr>
+          <w:rFonts w:ascii="Arial" w:hAnsi="Arial" w:cs="Arial"/>
+          <w:b/>
+          <w:bCs/>
+          <w:sz w:val="17"/>
+          <w:szCs w:val="17"/>
+        </w:rPr>
+        <w:t>Job Fair or Public Employment Service Office (PESO)</w:t>
       </w:r>
     </w:p>
     <w:p>
@@ -15252,12 +16695,24 @@
           <w:sz w:val="17"/>
           <w:szCs w:val="17"/>
         </w:rPr>
-        <w:t>[/] Others, please specify: {</w:t>
+        <w:t xml:space="preserve">[/] Others, please specify: </w:t>
+      </w:r>
+      <w:r>
+        <w:rPr>
+          <w:rFonts w:ascii="Arial" w:hAnsi="Arial" w:cs="Arial"/>
+          <w:b/>
+          <w:bCs/>
+          <w:sz w:val="17"/>
+          <w:szCs w:val="17"/>
+        </w:rPr>
+        <w:t>{</w:t>
       </w:r>
       <w:proofErr w:type="spellStart"/>
       <w:r>
         <w:rPr>
           <w:rFonts w:ascii="Arial" w:hAnsi="Arial" w:cs="Arial"/>
+          <w:b/>
+          <w:bCs/>
           <w:sz w:val="17"/>
           <w:szCs w:val="17"/>
         </w:rPr>
@@ -15267,6 +16722,8 @@
       <w:r>
         <w:rPr>
           <w:rFonts w:ascii="Arial" w:hAnsi="Arial" w:cs="Arial"/>
+          <w:b/>
+          <w:bCs/>
           <w:sz w:val="17"/>
           <w:szCs w:val="17"/>
         </w:rPr>
@@ -15397,17 +16854,29 @@
         <w:ind w:left="720"/>
         <w:rPr>
           <w:rFonts w:ascii="Arial" w:hAnsi="Arial" w:cs="Arial"/>
-          <w:sz w:val="17"/>
-          <w:szCs w:val="17"/>
-        </w:rPr>
-      </w:pPr>
-      <w:r>
-        <w:rPr>
-          <w:rFonts w:ascii="Arial" w:hAnsi="Arial" w:cs="Arial"/>
-          <w:sz w:val="17"/>
-          <w:szCs w:val="17"/>
-        </w:rPr>
-        <w:t>[/] Less than a month</w:t>
+          <w:b/>
+          <w:bCs/>
+          <w:sz w:val="17"/>
+          <w:szCs w:val="17"/>
+        </w:rPr>
+      </w:pPr>
+      <w:r>
+        <w:rPr>
+          <w:rFonts w:ascii="Arial" w:hAnsi="Arial" w:cs="Arial"/>
+          <w:sz w:val="17"/>
+          <w:szCs w:val="17"/>
+        </w:rPr>
+        <w:t xml:space="preserve">[/] </w:t>
+      </w:r>
+      <w:r>
+        <w:rPr>
+          <w:rFonts w:ascii="Arial" w:hAnsi="Arial" w:cs="Arial"/>
+          <w:b/>
+          <w:bCs/>
+          <w:sz w:val="17"/>
+          <w:szCs w:val="17"/>
+        </w:rPr>
+        <w:t>Less than a month</w:t>
       </w:r>
     </w:p>
     <w:p>
@@ -15510,7 +16979,17 @@
           <w:sz w:val="17"/>
           <w:szCs w:val="17"/>
         </w:rPr>
-        <w:t>[/] 1 to 6 months</w:t>
+        <w:t xml:space="preserve">[/] </w:t>
+      </w:r>
+      <w:r>
+        <w:rPr>
+          <w:rFonts w:ascii="Arial" w:hAnsi="Arial" w:cs="Arial"/>
+          <w:b/>
+          <w:bCs/>
+          <w:sz w:val="17"/>
+          <w:szCs w:val="17"/>
+        </w:rPr>
+        <w:t>1 to 6 months</w:t>
       </w:r>
     </w:p>
     <w:p>
@@ -15603,7 +17082,17 @@
           <w:sz w:val="17"/>
           <w:szCs w:val="17"/>
         </w:rPr>
-        <w:t>[/] 7 to 11 months</w:t>
+        <w:t xml:space="preserve">[/] </w:t>
+      </w:r>
+      <w:r>
+        <w:rPr>
+          <w:rFonts w:ascii="Arial" w:hAnsi="Arial" w:cs="Arial"/>
+          <w:b/>
+          <w:bCs/>
+          <w:sz w:val="17"/>
+          <w:szCs w:val="17"/>
+        </w:rPr>
+        <w:t>7 to 11 months</w:t>
       </w:r>
     </w:p>
     <w:p>
@@ -15696,7 +17185,17 @@
           <w:sz w:val="17"/>
           <w:szCs w:val="17"/>
         </w:rPr>
-        <w:t>[/] 1 year to less than 2 years</w:t>
+        <w:t xml:space="preserve">[/] </w:t>
+      </w:r>
+      <w:r>
+        <w:rPr>
+          <w:rFonts w:ascii="Arial" w:hAnsi="Arial" w:cs="Arial"/>
+          <w:b/>
+          <w:bCs/>
+          <w:sz w:val="17"/>
+          <w:szCs w:val="17"/>
+        </w:rPr>
+        <w:t>1 year to less than 2 years</w:t>
       </w:r>
     </w:p>
     <w:p>
@@ -15752,6 +17251,7 @@
           <w:sz w:val="17"/>
           <w:szCs w:val="17"/>
         </w:rPr>
+        <w:lastRenderedPageBreak/>
         <w:t>{#</w:t>
       </w:r>
       <w:proofErr w:type="gramStart"/>
@@ -15789,8 +17289,17 @@
           <w:sz w:val="17"/>
           <w:szCs w:val="17"/>
         </w:rPr>
-        <w:lastRenderedPageBreak/>
-        <w:t>[/] 2 years to less than 3 years</w:t>
+        <w:t xml:space="preserve">[/] </w:t>
+      </w:r>
+      <w:r>
+        <w:rPr>
+          <w:rFonts w:ascii="Arial" w:hAnsi="Arial" w:cs="Arial"/>
+          <w:b/>
+          <w:bCs/>
+          <w:sz w:val="17"/>
+          <w:szCs w:val="17"/>
+        </w:rPr>
+        <w:t>2 years to less than 3 years</w:t>
       </w:r>
     </w:p>
     <w:p>
@@ -15883,7 +17392,17 @@
           <w:sz w:val="17"/>
           <w:szCs w:val="17"/>
         </w:rPr>
-        <w:t>[/] 3 years to less than 4 years</w:t>
+        <w:t xml:space="preserve">[/] </w:t>
+      </w:r>
+      <w:r>
+        <w:rPr>
+          <w:rFonts w:ascii="Arial" w:hAnsi="Arial" w:cs="Arial"/>
+          <w:b/>
+          <w:bCs/>
+          <w:sz w:val="17"/>
+          <w:szCs w:val="17"/>
+        </w:rPr>
+        <w:t>3 years to less than 4 years</w:t>
       </w:r>
     </w:p>
     <w:p>
@@ -15976,12 +17495,24 @@
           <w:sz w:val="17"/>
           <w:szCs w:val="17"/>
         </w:rPr>
-        <w:t>[/] Others, please specify: {</w:t>
+        <w:t xml:space="preserve">[/] Others, please specify: </w:t>
+      </w:r>
+      <w:r>
+        <w:rPr>
+          <w:rFonts w:ascii="Arial" w:hAnsi="Arial" w:cs="Arial"/>
+          <w:b/>
+          <w:bCs/>
+          <w:sz w:val="17"/>
+          <w:szCs w:val="17"/>
+        </w:rPr>
+        <w:t>{</w:t>
       </w:r>
       <w:proofErr w:type="spellStart"/>
       <w:r>
         <w:rPr>
           <w:rFonts w:ascii="Arial" w:hAnsi="Arial" w:cs="Arial"/>
+          <w:b/>
+          <w:bCs/>
           <w:sz w:val="17"/>
           <w:szCs w:val="17"/>
         </w:rPr>
@@ -15991,6 +17522,8 @@
       <w:r>
         <w:rPr>
           <w:rFonts w:ascii="Arial" w:hAnsi="Arial" w:cs="Arial"/>
+          <w:b/>
+          <w:bCs/>
           <w:sz w:val="17"/>
           <w:szCs w:val="17"/>
         </w:rPr>
@@ -16094,8 +17627,8 @@
         <w:tblLook w:val="04A0" w:firstRow="1" w:lastRow="0" w:firstColumn="1" w:lastColumn="0" w:noHBand="0" w:noVBand="1"/>
       </w:tblPr>
       <w:tblGrid>
-        <w:gridCol w:w="1009"/>
-        <w:gridCol w:w="3637"/>
+        <w:gridCol w:w="1008"/>
+        <w:gridCol w:w="3638"/>
         <w:gridCol w:w="3994"/>
       </w:tblGrid>
       <w:tr>
@@ -16231,7 +17764,7 @@
                 <w:sz w:val="17"/>
                 <w:szCs w:val="17"/>
               </w:rPr>
-              <w:t xml:space="preserve">Managerial or </w:t>
+              <w:t>Managerial o</w:t>
             </w:r>
             <w:r>
               <w:rPr>
@@ -16240,7 +17773,7 @@
                 <w:szCs w:val="17"/>
               </w:rPr>
               <w:lastRenderedPageBreak/>
-              <w:t>Executive</w:t>
+              <w:t>r Executive</w:t>
             </w:r>
           </w:p>
           <w:p>
@@ -16321,7 +17854,7 @@
                 <w:sz w:val="17"/>
                 <w:szCs w:val="17"/>
               </w:rPr>
-              <w:t>rank}[</w:t>
+              <w:t>rank}</w:t>
             </w:r>
             <w:r>
               <w:rPr>
@@ -16331,15 +17864,15 @@
                 <w:sz w:val="17"/>
                 <w:szCs w:val="17"/>
               </w:rPr>
-              <w:t>/</w:t>
-            </w:r>
-            <w:r>
-              <w:rPr>
-                <w:rFonts w:ascii="Arial" w:hAnsi="Arial" w:cs="Arial"/>
-                <w:sz w:val="17"/>
-                <w:szCs w:val="17"/>
-              </w:rPr>
-              <w:t>]{</w:t>
+              <w:t>[/]</w:t>
+            </w:r>
+            <w:r>
+              <w:rPr>
+                <w:rFonts w:ascii="Arial" w:hAnsi="Arial" w:cs="Arial"/>
+                <w:sz w:val="17"/>
+                <w:szCs w:val="17"/>
+              </w:rPr>
+              <w:t>{</w:t>
             </w:r>
             <w:proofErr w:type="gramEnd"/>
             <w:r>
@@ -16497,7 +18030,7 @@
                 <w:sz w:val="17"/>
                 <w:szCs w:val="17"/>
               </w:rPr>
-              <w:t>professional}[</w:t>
+              <w:t>professional}</w:t>
             </w:r>
             <w:r>
               <w:rPr>
@@ -16507,15 +18040,15 @@
                 <w:sz w:val="17"/>
                 <w:szCs w:val="17"/>
               </w:rPr>
-              <w:t>/</w:t>
-            </w:r>
-            <w:r>
-              <w:rPr>
-                <w:rFonts w:ascii="Arial" w:hAnsi="Arial" w:cs="Arial"/>
-                <w:sz w:val="17"/>
-                <w:szCs w:val="17"/>
-              </w:rPr>
-              <w:t>]{</w:t>
+              <w:t>[/]</w:t>
+            </w:r>
+            <w:r>
+              <w:rPr>
+                <w:rFonts w:ascii="Arial" w:hAnsi="Arial" w:cs="Arial"/>
+                <w:sz w:val="17"/>
+                <w:szCs w:val="17"/>
+              </w:rPr>
+              <w:t>{</w:t>
             </w:r>
             <w:proofErr w:type="gramEnd"/>
             <w:r>
@@ -16673,7 +18206,7 @@
                 <w:sz w:val="17"/>
                 <w:szCs w:val="17"/>
               </w:rPr>
-              <w:t>managerial}[</w:t>
+              <w:t>managerial}</w:t>
             </w:r>
             <w:r>
               <w:rPr>
@@ -16683,15 +18216,15 @@
                 <w:sz w:val="17"/>
                 <w:szCs w:val="17"/>
               </w:rPr>
-              <w:t>/</w:t>
-            </w:r>
-            <w:r>
-              <w:rPr>
-                <w:rFonts w:ascii="Arial" w:hAnsi="Arial" w:cs="Arial"/>
-                <w:sz w:val="17"/>
-                <w:szCs w:val="17"/>
-              </w:rPr>
-              <w:t>]{</w:t>
+              <w:t>[/]</w:t>
+            </w:r>
+            <w:r>
+              <w:rPr>
+                <w:rFonts w:ascii="Arial" w:hAnsi="Arial" w:cs="Arial"/>
+                <w:sz w:val="17"/>
+                <w:szCs w:val="17"/>
+              </w:rPr>
+              <w:t>{</w:t>
             </w:r>
             <w:proofErr w:type="gramEnd"/>
             <w:r>
@@ -16849,7 +18382,7 @@
                 <w:sz w:val="17"/>
                 <w:szCs w:val="17"/>
               </w:rPr>
-              <w:t>employed}[</w:t>
+              <w:t>employed}</w:t>
             </w:r>
             <w:r>
               <w:rPr>
@@ -16859,15 +18392,15 @@
                 <w:sz w:val="17"/>
                 <w:szCs w:val="17"/>
               </w:rPr>
-              <w:t>/</w:t>
-            </w:r>
-            <w:r>
-              <w:rPr>
-                <w:rFonts w:ascii="Arial" w:hAnsi="Arial" w:cs="Arial"/>
-                <w:sz w:val="17"/>
-                <w:szCs w:val="17"/>
-              </w:rPr>
-              <w:t>]{</w:t>
+              <w:t>[/]</w:t>
+            </w:r>
+            <w:r>
+              <w:rPr>
+                <w:rFonts w:ascii="Arial" w:hAnsi="Arial" w:cs="Arial"/>
+                <w:sz w:val="17"/>
+                <w:szCs w:val="17"/>
+              </w:rPr>
+              <w:t>{</w:t>
             </w:r>
             <w:proofErr w:type="gramEnd"/>
             <w:r>
@@ -17040,7 +18573,7 @@
                 <w:sz w:val="17"/>
                 <w:szCs w:val="17"/>
               </w:rPr>
-              <w:t>rank}[</w:t>
+              <w:t>rank}</w:t>
             </w:r>
             <w:r>
               <w:rPr>
@@ -17050,15 +18583,15 @@
                 <w:sz w:val="17"/>
                 <w:szCs w:val="17"/>
               </w:rPr>
-              <w:t>/</w:t>
-            </w:r>
-            <w:r>
-              <w:rPr>
-                <w:rFonts w:ascii="Arial" w:hAnsi="Arial" w:cs="Arial"/>
-                <w:sz w:val="17"/>
-                <w:szCs w:val="17"/>
-              </w:rPr>
-              <w:t>]{</w:t>
+              <w:t>[/]</w:t>
+            </w:r>
+            <w:r>
+              <w:rPr>
+                <w:rFonts w:ascii="Arial" w:hAnsi="Arial" w:cs="Arial"/>
+                <w:sz w:val="17"/>
+                <w:szCs w:val="17"/>
+              </w:rPr>
+              <w:t>{</w:t>
             </w:r>
             <w:proofErr w:type="gramEnd"/>
             <w:r>
@@ -17216,7 +18749,7 @@
                 <w:sz w:val="17"/>
                 <w:szCs w:val="17"/>
               </w:rPr>
-              <w:t>professional}[</w:t>
+              <w:t>professional}</w:t>
             </w:r>
             <w:r>
               <w:rPr>
@@ -17226,15 +18759,15 @@
                 <w:sz w:val="17"/>
                 <w:szCs w:val="17"/>
               </w:rPr>
-              <w:t>/</w:t>
-            </w:r>
-            <w:r>
-              <w:rPr>
-                <w:rFonts w:ascii="Arial" w:hAnsi="Arial" w:cs="Arial"/>
-                <w:sz w:val="17"/>
-                <w:szCs w:val="17"/>
-              </w:rPr>
-              <w:t>]{</w:t>
+              <w:t>[/]</w:t>
+            </w:r>
+            <w:r>
+              <w:rPr>
+                <w:rFonts w:ascii="Arial" w:hAnsi="Arial" w:cs="Arial"/>
+                <w:sz w:val="17"/>
+                <w:szCs w:val="17"/>
+              </w:rPr>
+              <w:t>{</w:t>
             </w:r>
             <w:proofErr w:type="gramEnd"/>
             <w:r>
@@ -17392,7 +18925,7 @@
                 <w:sz w:val="17"/>
                 <w:szCs w:val="17"/>
               </w:rPr>
-              <w:t>managerial}[</w:t>
+              <w:t>managerial}</w:t>
             </w:r>
             <w:r>
               <w:rPr>
@@ -17402,15 +18935,15 @@
                 <w:sz w:val="17"/>
                 <w:szCs w:val="17"/>
               </w:rPr>
-              <w:t>/</w:t>
-            </w:r>
-            <w:r>
-              <w:rPr>
-                <w:rFonts w:ascii="Arial" w:hAnsi="Arial" w:cs="Arial"/>
-                <w:sz w:val="17"/>
-                <w:szCs w:val="17"/>
-              </w:rPr>
-              <w:t>]{</w:t>
+              <w:t>[/]</w:t>
+            </w:r>
+            <w:r>
+              <w:rPr>
+                <w:rFonts w:ascii="Arial" w:hAnsi="Arial" w:cs="Arial"/>
+                <w:sz w:val="17"/>
+                <w:szCs w:val="17"/>
+              </w:rPr>
+              <w:t>{</w:t>
             </w:r>
             <w:proofErr w:type="gramEnd"/>
             <w:r>
@@ -17568,7 +19101,7 @@
                 <w:sz w:val="17"/>
                 <w:szCs w:val="17"/>
               </w:rPr>
-              <w:t>employed}[</w:t>
+              <w:t>employed}</w:t>
             </w:r>
             <w:r>
               <w:rPr>
@@ -17578,15 +19111,15 @@
                 <w:sz w:val="17"/>
                 <w:szCs w:val="17"/>
               </w:rPr>
-              <w:t>/</w:t>
-            </w:r>
-            <w:r>
-              <w:rPr>
-                <w:rFonts w:ascii="Arial" w:hAnsi="Arial" w:cs="Arial"/>
-                <w:sz w:val="17"/>
-                <w:szCs w:val="17"/>
-              </w:rPr>
-              <w:t>]{</w:t>
+              <w:t>[/]</w:t>
+            </w:r>
+            <w:r>
+              <w:rPr>
+                <w:rFonts w:ascii="Arial" w:hAnsi="Arial" w:cs="Arial"/>
+                <w:sz w:val="17"/>
+                <w:szCs w:val="17"/>
+              </w:rPr>
+              <w:t>{</w:t>
             </w:r>
             <w:proofErr w:type="gramEnd"/>
             <w:r>
@@ -17801,7 +19334,17 @@
           <w:sz w:val="17"/>
           <w:szCs w:val="17"/>
         </w:rPr>
-        <w:t>[/] Below P5,000.00</w:t>
+        <w:t xml:space="preserve">[/] </w:t>
+      </w:r>
+      <w:r>
+        <w:rPr>
+          <w:rFonts w:ascii="Arial" w:hAnsi="Arial" w:cs="Arial"/>
+          <w:b/>
+          <w:bCs/>
+          <w:sz w:val="17"/>
+          <w:szCs w:val="17"/>
+        </w:rPr>
+        <w:t>Below P5,000.00</w:t>
       </w:r>
     </w:p>
     <w:p>
@@ -17894,7 +19437,17 @@
           <w:sz w:val="17"/>
           <w:szCs w:val="17"/>
         </w:rPr>
-        <w:t>[/] P5,000.00 to less than P10,000.00</w:t>
+        <w:t xml:space="preserve">[/] </w:t>
+      </w:r>
+      <w:r>
+        <w:rPr>
+          <w:rFonts w:ascii="Arial" w:hAnsi="Arial" w:cs="Arial"/>
+          <w:b/>
+          <w:bCs/>
+          <w:sz w:val="17"/>
+          <w:szCs w:val="17"/>
+        </w:rPr>
+        <w:t>P5,000.00 to less than P10,000.00</w:t>
       </w:r>
     </w:p>
     <w:p>
@@ -17987,7 +19540,17 @@
           <w:sz w:val="17"/>
           <w:szCs w:val="17"/>
         </w:rPr>
-        <w:t>[/] P10,000.00 to less than P15,000.00</w:t>
+        <w:t xml:space="preserve">[/] </w:t>
+      </w:r>
+      <w:r>
+        <w:rPr>
+          <w:rFonts w:ascii="Arial" w:hAnsi="Arial" w:cs="Arial"/>
+          <w:b/>
+          <w:bCs/>
+          <w:sz w:val="17"/>
+          <w:szCs w:val="17"/>
+        </w:rPr>
+        <w:t>P10,000.00 to less than P15,000.00</w:t>
       </w:r>
     </w:p>
     <w:p>
@@ -18080,7 +19643,17 @@
           <w:sz w:val="17"/>
           <w:szCs w:val="17"/>
         </w:rPr>
-        <w:t>[/] P15,000.00 to less than P20,000.00</w:t>
+        <w:t xml:space="preserve">[/] </w:t>
+      </w:r>
+      <w:r>
+        <w:rPr>
+          <w:rFonts w:ascii="Arial" w:hAnsi="Arial" w:cs="Arial"/>
+          <w:b/>
+          <w:bCs/>
+          <w:sz w:val="17"/>
+          <w:szCs w:val="17"/>
+        </w:rPr>
+        <w:t>P15,000.00 to less than P20,000.00</w:t>
       </w:r>
     </w:p>
     <w:p>
@@ -18173,7 +19746,17 @@
           <w:sz w:val="17"/>
           <w:szCs w:val="17"/>
         </w:rPr>
-        <w:t>[/] P20,000.00 to less than P25,000.00</w:t>
+        <w:t xml:space="preserve">[/] </w:t>
+      </w:r>
+      <w:r>
+        <w:rPr>
+          <w:rFonts w:ascii="Arial" w:hAnsi="Arial" w:cs="Arial"/>
+          <w:b/>
+          <w:bCs/>
+          <w:sz w:val="17"/>
+          <w:szCs w:val="17"/>
+        </w:rPr>
+        <w:t>P20,000.00 to less than P25,000.00</w:t>
       </w:r>
     </w:p>
     <w:p>
@@ -18266,7 +19849,17 @@
           <w:sz w:val="17"/>
           <w:szCs w:val="17"/>
         </w:rPr>
-        <w:t>[/] P25,000.00 and above</w:t>
+        <w:t xml:space="preserve">[/] </w:t>
+      </w:r>
+      <w:r>
+        <w:rPr>
+          <w:rFonts w:ascii="Arial" w:hAnsi="Arial" w:cs="Arial"/>
+          <w:b/>
+          <w:bCs/>
+          <w:sz w:val="17"/>
+          <w:szCs w:val="17"/>
+        </w:rPr>
+        <w:t>P25,000.00 and above</w:t>
       </w:r>
     </w:p>
     <w:p>
@@ -18393,7 +19986,17 @@
           <w:sz w:val="17"/>
           <w:szCs w:val="17"/>
         </w:rPr>
-        <w:t>[/] Yes</w:t>
+        <w:t xml:space="preserve">[/] </w:t>
+      </w:r>
+      <w:r>
+        <w:rPr>
+          <w:rFonts w:ascii="Arial" w:hAnsi="Arial" w:cs="Arial"/>
+          <w:b/>
+          <w:bCs/>
+          <w:sz w:val="17"/>
+          <w:szCs w:val="17"/>
+        </w:rPr>
+        <w:t>Yes</w:t>
       </w:r>
     </w:p>
     <w:p>
@@ -18496,7 +20099,17 @@
           <w:sz w:val="17"/>
           <w:szCs w:val="17"/>
         </w:rPr>
-        <w:t>[/] No</w:t>
+        <w:t xml:space="preserve">[/] </w:t>
+      </w:r>
+      <w:r>
+        <w:rPr>
+          <w:rFonts w:ascii="Arial" w:hAnsi="Arial" w:cs="Arial"/>
+          <w:b/>
+          <w:bCs/>
+          <w:sz w:val="17"/>
+          <w:szCs w:val="17"/>
+        </w:rPr>
+        <w:t>No</w:t>
       </w:r>
     </w:p>
     <w:p>
@@ -18716,7 +20329,17 @@
           <w:sz w:val="17"/>
           <w:szCs w:val="17"/>
         </w:rPr>
-        <w:t>[/] Communication skills</w:t>
+        <w:t xml:space="preserve">[/] </w:t>
+      </w:r>
+      <w:r>
+        <w:rPr>
+          <w:rFonts w:ascii="Arial" w:hAnsi="Arial" w:cs="Arial"/>
+          <w:b/>
+          <w:bCs/>
+          <w:sz w:val="17"/>
+          <w:szCs w:val="17"/>
+        </w:rPr>
+        <w:t>Communication skills</w:t>
       </w:r>
     </w:p>
     <w:p>
@@ -18819,7 +20442,17 @@
           <w:sz w:val="17"/>
           <w:szCs w:val="17"/>
         </w:rPr>
-        <w:t>[/] Human Relations skills</w:t>
+        <w:t xml:space="preserve">[/] </w:t>
+      </w:r>
+      <w:r>
+        <w:rPr>
+          <w:rFonts w:ascii="Arial" w:hAnsi="Arial" w:cs="Arial"/>
+          <w:b/>
+          <w:bCs/>
+          <w:sz w:val="17"/>
+          <w:szCs w:val="17"/>
+        </w:rPr>
+        <w:t>Human Relations skills</w:t>
       </w:r>
     </w:p>
     <w:p>
@@ -18922,7 +20555,17 @@
           <w:sz w:val="17"/>
           <w:szCs w:val="17"/>
         </w:rPr>
-        <w:t>[/] Entrepreneurial skills</w:t>
+        <w:t xml:space="preserve">[/] </w:t>
+      </w:r>
+      <w:r>
+        <w:rPr>
+          <w:rFonts w:ascii="Arial" w:hAnsi="Arial" w:cs="Arial"/>
+          <w:b/>
+          <w:bCs/>
+          <w:sz w:val="17"/>
+          <w:szCs w:val="17"/>
+        </w:rPr>
+        <w:t>Entrepreneurial skills</w:t>
       </w:r>
     </w:p>
     <w:p>
@@ -19025,7 +20668,17 @@
           <w:sz w:val="17"/>
           <w:szCs w:val="17"/>
         </w:rPr>
-        <w:t>[/] Information Technology skills</w:t>
+        <w:t xml:space="preserve">[/] </w:t>
+      </w:r>
+      <w:r>
+        <w:rPr>
+          <w:rFonts w:ascii="Arial" w:hAnsi="Arial" w:cs="Arial"/>
+          <w:b/>
+          <w:bCs/>
+          <w:sz w:val="17"/>
+          <w:szCs w:val="17"/>
+        </w:rPr>
+        <w:t>Information Technology skills</w:t>
       </w:r>
     </w:p>
     <w:p>
@@ -19128,7 +20781,17 @@
           <w:sz w:val="17"/>
           <w:szCs w:val="17"/>
         </w:rPr>
-        <w:t>[/] Problem-solving skills</w:t>
+        <w:t xml:space="preserve">[/] </w:t>
+      </w:r>
+      <w:r>
+        <w:rPr>
+          <w:rFonts w:ascii="Arial" w:hAnsi="Arial" w:cs="Arial"/>
+          <w:b/>
+          <w:bCs/>
+          <w:sz w:val="17"/>
+          <w:szCs w:val="17"/>
+        </w:rPr>
+        <w:t>Problem-solving skills</w:t>
       </w:r>
     </w:p>
     <w:p>
@@ -19194,6 +20857,7 @@
           <w:sz w:val="17"/>
           <w:szCs w:val="17"/>
         </w:rPr>
+        <w:lastRenderedPageBreak/>
         <w:t>{#</w:t>
       </w:r>
       <w:proofErr w:type="gramStart"/>
@@ -19231,8 +20895,17 @@
           <w:sz w:val="17"/>
           <w:szCs w:val="17"/>
         </w:rPr>
-        <w:lastRenderedPageBreak/>
-        <w:t>[/] Critical Thinking skills</w:t>
+        <w:t xml:space="preserve">[/] </w:t>
+      </w:r>
+      <w:r>
+        <w:rPr>
+          <w:rFonts w:ascii="Arial" w:hAnsi="Arial" w:cs="Arial"/>
+          <w:b/>
+          <w:bCs/>
+          <w:sz w:val="17"/>
+          <w:szCs w:val="17"/>
+        </w:rPr>
+        <w:t>Critical Thinking skills</w:t>
       </w:r>
     </w:p>
     <w:p>
@@ -19335,12 +21008,24 @@
           <w:sz w:val="17"/>
           <w:szCs w:val="17"/>
         </w:rPr>
-        <w:t>[/] Other skills, please specify: {</w:t>
+        <w:t xml:space="preserve">[/] Other skills, please specify: </w:t>
+      </w:r>
+      <w:r>
+        <w:rPr>
+          <w:rFonts w:ascii="Arial" w:hAnsi="Arial" w:cs="Arial"/>
+          <w:b/>
+          <w:bCs/>
+          <w:sz w:val="17"/>
+          <w:szCs w:val="17"/>
+        </w:rPr>
+        <w:t>{</w:t>
       </w:r>
       <w:proofErr w:type="spellStart"/>
       <w:r>
         <w:rPr>
           <w:rFonts w:ascii="Arial" w:hAnsi="Arial" w:cs="Arial"/>
+          <w:b/>
+          <w:bCs/>
           <w:sz w:val="17"/>
           <w:szCs w:val="17"/>
         </w:rPr>
@@ -19350,6 +21035,8 @@
       <w:r>
         <w:rPr>
           <w:rFonts w:ascii="Arial" w:hAnsi="Arial" w:cs="Arial"/>
+          <w:b/>
+          <w:bCs/>
           <w:sz w:val="17"/>
           <w:szCs w:val="17"/>
         </w:rPr>
@@ -19460,13 +21147,17 @@
         <w:spacing w:after="0" w:line="240" w:lineRule="auto"/>
         <w:rPr>
           <w:rFonts w:ascii="Arial" w:hAnsi="Arial" w:cs="Arial"/>
-          <w:sz w:val="17"/>
-          <w:szCs w:val="17"/>
-        </w:rPr>
-      </w:pPr>
-      <w:r>
-        <w:rPr>
-          <w:rFonts w:ascii="Arial" w:hAnsi="Arial" w:cs="Arial"/>
+          <w:b/>
+          <w:bCs/>
+          <w:sz w:val="17"/>
+          <w:szCs w:val="17"/>
+        </w:rPr>
+      </w:pPr>
+      <w:r>
+        <w:rPr>
+          <w:rFonts w:ascii="Arial" w:hAnsi="Arial" w:cs="Arial"/>
+          <w:b/>
+          <w:bCs/>
           <w:sz w:val="17"/>
           <w:szCs w:val="17"/>
         </w:rPr>
@@ -19476,6 +21167,8 @@
       <w:r>
         <w:rPr>
           <w:rFonts w:ascii="Arial" w:hAnsi="Arial" w:cs="Arial"/>
+          <w:b/>
+          <w:bCs/>
           <w:sz w:val="17"/>
           <w:szCs w:val="17"/>
         </w:rPr>
@@ -19485,6 +21178,8 @@
       <w:r>
         <w:rPr>
           <w:rFonts w:ascii="Arial" w:hAnsi="Arial" w:cs="Arial"/>
+          <w:b/>
+          <w:bCs/>
           <w:sz w:val="17"/>
           <w:szCs w:val="17"/>
         </w:rPr>
@@ -20001,7 +21696,7 @@
 </file>
 
 <file path=word/endnotes.xml><?xml version="1.0" encoding="utf-8"?>
-<w:endnotes xmlns:wpc="http://schemas.microsoft.com/office/word/2010/wordprocessingCanvas" xmlns:cx="http://schemas.microsoft.com/office/drawing/2014/chartex" xmlns:cx1="http://schemas.microsoft.com/office/drawing/2015/9/8/chartex" xmlns:cx2="http://schemas.microsoft.com/office/drawing/2015/10/21/chartex" xmlns:cx3="http://schemas.microsoft.com/office/drawing/2016/5/9/chartex" xmlns:cx4="http://schemas.microsoft.com/office/drawing/2016/5/10/chartex" xmlns:cx5="http://schemas.microsoft.com/office/drawing/2016/5/11/chartex" xmlns:cx6="http://schemas.microsoft.com/office/drawing/2016/5/12/chartex" xmlns:cx7="http://schemas.microsoft.com/office/drawing/2016/5/13/chartex" xmlns:cx8="http://schemas.microsoft.com/office/drawing/2016/5/14/chartex" xmlns:mc="http://schemas.openxmlformats.org/markup-compatibility/2006" xmlns:aink="http://schemas.microsoft.com/office/drawing/2016/ink" xmlns:am3d="http://schemas.microsoft.com/office/drawing/2017/model3d" xmlns:o="urn:schemas-microsoft-com:office:office" xmlns:oel="http://schemas.microsoft.com/office/2019/extlst" xmlns:r="http://schemas.openxmlformats.org/officeDocument/2006/relationships" xmlns:m="http://schemas.openxmlformats.org/officeDocument/2006/math" xmlns:v="urn:schemas-microsoft-com:vml" xmlns:wp14="http://schemas.microsoft.com/office/word/2010/wordprocessingDrawing" xmlns:wp="http://schemas.openxmlformats.org/drawingml/2006/wordprocessingDrawing" xmlns:w10="urn:schemas-microsoft-com:office:word" xmlns:w="http://schemas.openxmlformats.org/wordprocessingml/2006/main" xmlns:w14="http://schemas.microsoft.com/office/word/2010/wordml" xmlns:w15="http://schemas.microsoft.com/office/word/2012/wordml" xmlns:w16cex="http://schemas.microsoft.com/office/word/2018/wordml/cex" xmlns:w16cid="http://schemas.microsoft.com/office/word/2016/wordml/cid" xmlns:w16="http://schemas.microsoft.com/office/word/2018/wordml" xmlns:w16du="http://schemas.microsoft.com/office/word/2023/wordml/word16du" xmlns:w16sdtdh="http://schemas.microsoft.com/office/word/2020/wordml/sdtdatahash" xmlns:w16sdtfl="http://schemas.microsoft.com/office/word/2024/wordml/sdtformatlock" xmlns:w16se="http://schemas.microsoft.com/office/word/2015/wordml/symex" xmlns:wpg="http://schemas.microsoft.com/office/word/2010/wordprocessingGroup" xmlns:wpi="http://schemas.microsoft.com/office/word/2010/wordprocessingInk" xmlns:wne="http://schemas.microsoft.com/office/word/2006/wordml" xmlns:wps="http://schemas.microsoft.com/office/word/2010/wordprocessingShape" mc:Ignorable="w14 w15 w16se w16cid w16 w16cex w16sdtdh w16sdtfl w16du wp14">
+<w:endnotes xmlns:wpc="http://schemas.microsoft.com/office/word/2010/wordprocessingCanvas" xmlns:cx="http://schemas.microsoft.com/office/drawing/2014/chartex" xmlns:cx1="http://schemas.microsoft.com/office/drawing/2015/9/8/chartex" xmlns:cx2="http://schemas.microsoft.com/office/drawing/2015/10/21/chartex" xmlns:cx3="http://schemas.microsoft.com/office/drawing/2016/5/9/chartex" xmlns:cx4="http://schemas.microsoft.com/office/drawing/2016/5/10/chartex" xmlns:cx5="http://schemas.microsoft.com/office/drawing/2016/5/11/chartex" xmlns:cx6="http://schemas.microsoft.com/office/drawing/2016/5/12/chartex" xmlns:cx7="http://schemas.microsoft.com/office/drawing/2016/5/13/chartex" xmlns:cx8="http://schemas.microsoft.com/office/drawing/2016/5/14/chartex" xmlns:mc="http://schemas.openxmlformats.org/markup-compatibility/2006" xmlns:aink="http://schemas.microsoft.com/office/drawing/2016/ink" xmlns:am3d="http://schemas.microsoft.com/office/drawing/2017/model3d" xmlns:o="urn:schemas-microsoft-com:office:office" xmlns:oel="http://schemas.microsoft.com/office/2019/extlst" xmlns:r="http://schemas.openxmlformats.org/officeDocument/2006/relationships" xmlns:m="http://schemas.openxmlformats.org/officeDocument/2006/math" xmlns:v="urn:schemas-microsoft-com:vml" xmlns:wp14="http://schemas.microsoft.com/office/word/2010/wordprocessingDrawing" xmlns:wp="http://schemas.openxmlformats.org/drawingml/2006/wordprocessingDrawing" xmlns:w10="urn:schemas-microsoft-com:office:word" xmlns:w="http://schemas.openxmlformats.org/wordprocessingml/2006/main" xmlns:w14="http://schemas.microsoft.com/office/word/2010/wordml" xmlns:w15="http://schemas.microsoft.com/office/word/2012/wordml" xmlns:w16cei="http://schemas.microsoft.com/office/word/2026/wordml/cei" xmlns:w16cex="http://schemas.microsoft.com/office/word/2018/wordml/cex" xmlns:w16cid="http://schemas.microsoft.com/office/word/2016/wordml/cid" xmlns:w16="http://schemas.microsoft.com/office/word/2018/wordml" xmlns:w16du="http://schemas.microsoft.com/office/word/2023/wordml/word16du" xmlns:w16sdtdh="http://schemas.microsoft.com/office/word/2020/wordml/sdtdatahash" xmlns:w16sdtfl="http://schemas.microsoft.com/office/word/2024/wordml/sdtformatlock" xmlns:w16se="http://schemas.microsoft.com/office/word/2015/wordml/symex" xmlns:wpg="http://schemas.microsoft.com/office/word/2010/wordprocessingGroup" xmlns:wpi="http://schemas.microsoft.com/office/word/2010/wordprocessingInk" xmlns:wne="http://schemas.microsoft.com/office/word/2006/wordml" xmlns:wps="http://schemas.microsoft.com/office/word/2010/wordprocessingShape" mc:Ignorable="w14 w15 w16se w16cid w16 w16cex w16sdtdh w16sdtfl w16du wp14">
   <w:endnote w:type="separator" w:id="-1">
     <w:p>
       <w:pPr>
@@ -20026,7 +21721,7 @@
 </file>
 
 <file path=word/footnotes.xml><?xml version="1.0" encoding="utf-8"?>
-<w:footnotes xmlns:wpc="http://schemas.microsoft.com/office/word/2010/wordprocessingCanvas" xmlns:cx="http://schemas.microsoft.com/office/drawing/2014/chartex" xmlns:cx1="http://schemas.microsoft.com/office/drawing/2015/9/8/chartex" xmlns:cx2="http://schemas.microsoft.com/office/drawing/2015/10/21/chartex" xmlns:cx3="http://schemas.microsoft.com/office/drawing/2016/5/9/chartex" xmlns:cx4="http://schemas.microsoft.com/office/drawing/2016/5/10/chartex" xmlns:cx5="http://schemas.microsoft.com/office/drawing/2016/5/11/chartex" xmlns:cx6="http://schemas.microsoft.com/office/drawing/2016/5/12/chartex" xmlns:cx7="http://schemas.microsoft.com/office/drawing/2016/5/13/chartex" xmlns:cx8="http://schemas.microsoft.com/office/drawing/2016/5/14/chartex" xmlns:mc="http://schemas.openxmlformats.org/markup-compatibility/2006" xmlns:aink="http://schemas.microsoft.com/office/drawing/2016/ink" xmlns:am3d="http://schemas.microsoft.com/office/drawing/2017/model3d" xmlns:o="urn:schemas-microsoft-com:office:office" xmlns:oel="http://schemas.microsoft.com/office/2019/extlst" xmlns:r="http://schemas.openxmlformats.org/officeDocument/2006/relationships" xmlns:m="http://schemas.openxmlformats.org/officeDocument/2006/math" xmlns:v="urn:schemas-microsoft-com:vml" xmlns:wp14="http://schemas.microsoft.com/office/word/2010/wordprocessingDrawing" xmlns:wp="http://schemas.openxmlformats.org/drawingml/2006/wordprocessingDrawing" xmlns:w10="urn:schemas-microsoft-com:office:word" xmlns:w="http://schemas.openxmlformats.org/wordprocessingml/2006/main" xmlns:w14="http://schemas.microsoft.com/office/word/2010/wordml" xmlns:w15="http://schemas.microsoft.com/office/word/2012/wordml" xmlns:w16cex="http://schemas.microsoft.com/office/word/2018/wordml/cex" xmlns:w16cid="http://schemas.microsoft.com/office/word/2016/wordml/cid" xmlns:w16="http://schemas.microsoft.com/office/word/2018/wordml" xmlns:w16du="http://schemas.microsoft.com/office/word/2023/wordml/word16du" xmlns:w16sdtdh="http://schemas.microsoft.com/office/word/2020/wordml/sdtdatahash" xmlns:w16sdtfl="http://schemas.microsoft.com/office/word/2024/wordml/sdtformatlock" xmlns:w16se="http://schemas.microsoft.com/office/word/2015/wordml/symex" xmlns:wpg="http://schemas.microsoft.com/office/word/2010/wordprocessingGroup" xmlns:wpi="http://schemas.microsoft.com/office/word/2010/wordprocessingInk" xmlns:wne="http://schemas.microsoft.com/office/word/2006/wordml" xmlns:wps="http://schemas.microsoft.com/office/word/2010/wordprocessingShape" mc:Ignorable="w14 w15 w16se w16cid w16 w16cex w16sdtdh w16sdtfl w16du wp14">
+<w:footnotes xmlns:wpc="http://schemas.microsoft.com/office/word/2010/wordprocessingCanvas" xmlns:cx="http://schemas.microsoft.com/office/drawing/2014/chartex" xmlns:cx1="http://schemas.microsoft.com/office/drawing/2015/9/8/chartex" xmlns:cx2="http://schemas.microsoft.com/office/drawing/2015/10/21/chartex" xmlns:cx3="http://schemas.microsoft.com/office/drawing/2016/5/9/chartex" xmlns:cx4="http://schemas.microsoft.com/office/drawing/2016/5/10/chartex" xmlns:cx5="http://schemas.microsoft.com/office/drawing/2016/5/11/chartex" xmlns:cx6="http://schemas.microsoft.com/office/drawing/2016/5/12/chartex" xmlns:cx7="http://schemas.microsoft.com/office/drawing/2016/5/13/chartex" xmlns:cx8="http://schemas.microsoft.com/office/drawing/2016/5/14/chartex" xmlns:mc="http://schemas.openxmlformats.org/markup-compatibility/2006" xmlns:aink="http://schemas.microsoft.com/office/drawing/2016/ink" xmlns:am3d="http://schemas.microsoft.com/office/drawing/2017/model3d" xmlns:o="urn:schemas-microsoft-com:office:office" xmlns:oel="http://schemas.microsoft.com/office/2019/extlst" xmlns:r="http://schemas.openxmlformats.org/officeDocument/2006/relationships" xmlns:m="http://schemas.openxmlformats.org/officeDocument/2006/math" xmlns:v="urn:schemas-microsoft-com:vml" xmlns:wp14="http://schemas.microsoft.com/office/word/2010/wordprocessingDrawing" xmlns:wp="http://schemas.openxmlformats.org/drawingml/2006/wordprocessingDrawing" xmlns:w10="urn:schemas-microsoft-com:office:word" xmlns:w="http://schemas.openxmlformats.org/wordprocessingml/2006/main" xmlns:w14="http://schemas.microsoft.com/office/word/2010/wordml" xmlns:w15="http://schemas.microsoft.com/office/word/2012/wordml" xmlns:w16cei="http://schemas.microsoft.com/office/word/2026/wordml/cei" xmlns:w16cex="http://schemas.microsoft.com/office/word/2018/wordml/cex" xmlns:w16cid="http://schemas.microsoft.com/office/word/2016/wordml/cid" xmlns:w16="http://schemas.microsoft.com/office/word/2018/wordml" xmlns:w16du="http://schemas.microsoft.com/office/word/2023/wordml/word16du" xmlns:w16sdtdh="http://schemas.microsoft.com/office/word/2020/wordml/sdtdatahash" xmlns:w16sdtfl="http://schemas.microsoft.com/office/word/2024/wordml/sdtformatlock" xmlns:w16se="http://schemas.microsoft.com/office/word/2015/wordml/symex" xmlns:wpg="http://schemas.microsoft.com/office/word/2010/wordprocessingGroup" xmlns:wpi="http://schemas.microsoft.com/office/word/2010/wordprocessingInk" xmlns:wne="http://schemas.microsoft.com/office/word/2006/wordml" xmlns:wps="http://schemas.microsoft.com/office/word/2010/wordprocessingShape" mc:Ignorable="w14 w15 w16se w16cid w16 w16cex w16sdtdh w16sdtfl w16du wp14">
   <w:footnote w:type="separator" w:id="-1">
     <w:p>
       <w:pPr>
@@ -20051,7 +21746,7 @@
 </file>
 
 <file path=word/header1.xml><?xml version="1.0" encoding="utf-8"?>
-<w:hdr xmlns:wpc="http://schemas.microsoft.com/office/word/2010/wordprocessingCanvas" xmlns:cx="http://schemas.microsoft.com/office/drawing/2014/chartex" xmlns:cx1="http://schemas.microsoft.com/office/drawing/2015/9/8/chartex" xmlns:cx2="http://schemas.microsoft.com/office/drawing/2015/10/21/chartex" xmlns:cx3="http://schemas.microsoft.com/office/drawing/2016/5/9/chartex" xmlns:cx4="http://schemas.microsoft.com/office/drawing/2016/5/10/chartex" xmlns:cx5="http://schemas.microsoft.com/office/drawing/2016/5/11/chartex" xmlns:cx6="http://schemas.microsoft.com/office/drawing/2016/5/12/chartex" xmlns:cx7="http://schemas.microsoft.com/office/drawing/2016/5/13/chartex" xmlns:cx8="http://schemas.microsoft.com/office/drawing/2016/5/14/chartex" xmlns:mc="http://schemas.openxmlformats.org/markup-compatibility/2006" xmlns:aink="http://schemas.microsoft.com/office/drawing/2016/ink" xmlns:am3d="http://schemas.microsoft.com/office/drawing/2017/model3d" xmlns:o="urn:schemas-microsoft-com:office:office" xmlns:oel="http://schemas.microsoft.com/office/2019/extlst" xmlns:r="http://schemas.openxmlformats.org/officeDocument/2006/relationships" xmlns:m="http://schemas.openxmlformats.org/officeDocument/2006/math" xmlns:v="urn:schemas-microsoft-com:vml" xmlns:wp14="http://schemas.microsoft.com/office/word/2010/wordprocessingDrawing" xmlns:wp="http://schemas.openxmlformats.org/drawingml/2006/wordprocessingDrawing" xmlns:w10="urn:schemas-microsoft-com:office:word" xmlns:w="http://schemas.openxmlformats.org/wordprocessingml/2006/main" xmlns:w14="http://schemas.microsoft.com/office/word/2010/wordml" xmlns:w15="http://schemas.microsoft.com/office/word/2012/wordml" xmlns:w16cex="http://schemas.microsoft.com/office/word/2018/wordml/cex" xmlns:w16cid="http://schemas.microsoft.com/office/word/2016/wordml/cid" xmlns:w16="http://schemas.microsoft.com/office/word/2018/wordml" xmlns:w16du="http://schemas.microsoft.com/office/word/2023/wordml/word16du" xmlns:w16sdtdh="http://schemas.microsoft.com/office/word/2020/wordml/sdtdatahash" xmlns:w16sdtfl="http://schemas.microsoft.com/office/word/2024/wordml/sdtformatlock" xmlns:w16se="http://schemas.microsoft.com/office/word/2015/wordml/symex" xmlns:wpg="http://schemas.microsoft.com/office/word/2010/wordprocessingGroup" xmlns:wpi="http://schemas.microsoft.com/office/word/2010/wordprocessingInk" xmlns:wne="http://schemas.microsoft.com/office/word/2006/wordml" xmlns:wps="http://schemas.microsoft.com/office/word/2010/wordprocessingShape" mc:Ignorable="w14 w15 w16se w16cid w16 w16cex w16sdtdh w16sdtfl w16du wp14">
+<w:hdr xmlns:wpc="http://schemas.microsoft.com/office/word/2010/wordprocessingCanvas" xmlns:cx="http://schemas.microsoft.com/office/drawing/2014/chartex" xmlns:cx1="http://schemas.microsoft.com/office/drawing/2015/9/8/chartex" xmlns:cx2="http://schemas.microsoft.com/office/drawing/2015/10/21/chartex" xmlns:cx3="http://schemas.microsoft.com/office/drawing/2016/5/9/chartex" xmlns:cx4="http://schemas.microsoft.com/office/drawing/2016/5/10/chartex" xmlns:cx5="http://schemas.microsoft.com/office/drawing/2016/5/11/chartex" xmlns:cx6="http://schemas.microsoft.com/office/drawing/2016/5/12/chartex" xmlns:cx7="http://schemas.microsoft.com/office/drawing/2016/5/13/chartex" xmlns:cx8="http://schemas.microsoft.com/office/drawing/2016/5/14/chartex" xmlns:mc="http://schemas.openxmlformats.org/markup-compatibility/2006" xmlns:aink="http://schemas.microsoft.com/office/drawing/2016/ink" xmlns:am3d="http://schemas.microsoft.com/office/drawing/2017/model3d" xmlns:o="urn:schemas-microsoft-com:office:office" xmlns:oel="http://schemas.microsoft.com/office/2019/extlst" xmlns:r="http://schemas.openxmlformats.org/officeDocument/2006/relationships" xmlns:m="http://schemas.openxmlformats.org/officeDocument/2006/math" xmlns:v="urn:schemas-microsoft-com:vml" xmlns:wp14="http://schemas.microsoft.com/office/word/2010/wordprocessingDrawing" xmlns:wp="http://schemas.openxmlformats.org/drawingml/2006/wordprocessingDrawing" xmlns:w10="urn:schemas-microsoft-com:office:word" xmlns:w="http://schemas.openxmlformats.org/wordprocessingml/2006/main" xmlns:w14="http://schemas.microsoft.com/office/word/2010/wordml" xmlns:w15="http://schemas.microsoft.com/office/word/2012/wordml" xmlns:w16cei="http://schemas.microsoft.com/office/word/2026/wordml/cei" xmlns:w16cex="http://schemas.microsoft.com/office/word/2018/wordml/cex" xmlns:w16cid="http://schemas.microsoft.com/office/word/2016/wordml/cid" xmlns:w16="http://schemas.microsoft.com/office/word/2018/wordml" xmlns:w16du="http://schemas.microsoft.com/office/word/2023/wordml/word16du" xmlns:w16sdtdh="http://schemas.microsoft.com/office/word/2020/wordml/sdtdatahash" xmlns:w16sdtfl="http://schemas.microsoft.com/office/word/2024/wordml/sdtformatlock" xmlns:w16se="http://schemas.microsoft.com/office/word/2015/wordml/symex" xmlns:wpg="http://schemas.microsoft.com/office/word/2010/wordprocessingGroup" xmlns:wpi="http://schemas.microsoft.com/office/word/2010/wordprocessingInk" xmlns:wne="http://schemas.microsoft.com/office/word/2006/wordml" xmlns:wps="http://schemas.microsoft.com/office/word/2010/wordprocessingShape" mc:Ignorable="w14 w15 w16se w16cid w16 w16cex w16sdtdh w16sdtfl w16du wp14">
   <w:p>
     <w:pPr>
       <w:pStyle w:val="Header"/>
@@ -20097,7 +21792,7 @@
 </file>
 
 <file path=word/numbering.xml><?xml version="1.0" encoding="utf-8"?>
-<w:numbering xmlns:wpc="http://schemas.microsoft.com/office/word/2010/wordprocessingCanvas" xmlns:cx="http://schemas.microsoft.com/office/drawing/2014/chartex" xmlns:cx1="http://schemas.microsoft.com/office/drawing/2015/9/8/chartex" xmlns:cx2="http://schemas.microsoft.com/office/drawing/2015/10/21/chartex" xmlns:cx3="http://schemas.microsoft.com/office/drawing/2016/5/9/chartex" xmlns:cx4="http://schemas.microsoft.com/office/drawing/2016/5/10/chartex" xmlns:cx5="http://schemas.microsoft.com/office/drawing/2016/5/11/chartex" xmlns:cx6="http://schemas.microsoft.com/office/drawing/2016/5/12/chartex" xmlns:cx7="http://schemas.microsoft.com/office/drawing/2016/5/13/chartex" xmlns:cx8="http://schemas.microsoft.com/office/drawing/2016/5/14/chartex" xmlns:mc="http://schemas.openxmlformats.org/markup-compatibility/2006" xmlns:aink="http://schemas.microsoft.com/office/drawing/2016/ink" xmlns:am3d="http://schemas.microsoft.com/office/drawing/2017/model3d" xmlns:o="urn:schemas-microsoft-com:office:office" xmlns:oel="http://schemas.microsoft.com/office/2019/extlst" xmlns:r="http://schemas.openxmlformats.org/officeDocument/2006/relationships" xmlns:m="http://schemas.openxmlformats.org/officeDocument/2006/math" xmlns:v="urn:schemas-microsoft-com:vml" xmlns:wp14="http://schemas.microsoft.com/office/word/2010/wordprocessingDrawing" xmlns:wp="http://schemas.openxmlformats.org/drawingml/2006/wordprocessingDrawing" xmlns:w10="urn:schemas-microsoft-com:office:word" xmlns:w="http://schemas.openxmlformats.org/wordprocessingml/2006/main" xmlns:w14="http://schemas.microsoft.com/office/word/2010/wordml" xmlns:w15="http://schemas.microsoft.com/office/word/2012/wordml" xmlns:w16cex="http://schemas.microsoft.com/office/word/2018/wordml/cex" xmlns:w16cid="http://schemas.microsoft.com/office/word/2016/wordml/cid" xmlns:w16="http://schemas.microsoft.com/office/word/2018/wordml" xmlns:w16du="http://schemas.microsoft.com/office/word/2023/wordml/word16du" xmlns:w16sdtdh="http://schemas.microsoft.com/office/word/2020/wordml/sdtdatahash" xmlns:w16sdtfl="http://schemas.microsoft.com/office/word/2024/wordml/sdtformatlock" xmlns:w16se="http://schemas.microsoft.com/office/word/2015/wordml/symex" xmlns:wpg="http://schemas.microsoft.com/office/word/2010/wordprocessingGroup" xmlns:wpi="http://schemas.microsoft.com/office/word/2010/wordprocessingInk" xmlns:wne="http://schemas.microsoft.com/office/word/2006/wordml" xmlns:wps="http://schemas.microsoft.com/office/word/2010/wordprocessingShape" mc:Ignorable="w14 w15 w16se w16cid w16 w16cex w16sdtdh w16sdtfl w16du wp14">
+<w:numbering xmlns:wpc="http://schemas.microsoft.com/office/word/2010/wordprocessingCanvas" xmlns:cx="http://schemas.microsoft.com/office/drawing/2014/chartex" xmlns:cx1="http://schemas.microsoft.com/office/drawing/2015/9/8/chartex" xmlns:cx2="http://schemas.microsoft.com/office/drawing/2015/10/21/chartex" xmlns:cx3="http://schemas.microsoft.com/office/drawing/2016/5/9/chartex" xmlns:cx4="http://schemas.microsoft.com/office/drawing/2016/5/10/chartex" xmlns:cx5="http://schemas.microsoft.com/office/drawing/2016/5/11/chartex" xmlns:cx6="http://schemas.microsoft.com/office/drawing/2016/5/12/chartex" xmlns:cx7="http://schemas.microsoft.com/office/drawing/2016/5/13/chartex" xmlns:cx8="http://schemas.microsoft.com/office/drawing/2016/5/14/chartex" xmlns:mc="http://schemas.openxmlformats.org/markup-compatibility/2006" xmlns:aink="http://schemas.microsoft.com/office/drawing/2016/ink" xmlns:am3d="http://schemas.microsoft.com/office/drawing/2017/model3d" xmlns:o="urn:schemas-microsoft-com:office:office" xmlns:oel="http://schemas.microsoft.com/office/2019/extlst" xmlns:r="http://schemas.openxmlformats.org/officeDocument/2006/relationships" xmlns:m="http://schemas.openxmlformats.org/officeDocument/2006/math" xmlns:v="urn:schemas-microsoft-com:vml" xmlns:wp14="http://schemas.microsoft.com/office/word/2010/wordprocessingDrawing" xmlns:wp="http://schemas.openxmlformats.org/drawingml/2006/wordprocessingDrawing" xmlns:w10="urn:schemas-microsoft-com:office:word" xmlns:w="http://schemas.openxmlformats.org/wordprocessingml/2006/main" xmlns:w14="http://schemas.microsoft.com/office/word/2010/wordml" xmlns:w15="http://schemas.microsoft.com/office/word/2012/wordml" xmlns:w16cei="http://schemas.microsoft.com/office/word/2026/wordml/cei" xmlns:w16cex="http://schemas.microsoft.com/office/word/2018/wordml/cex" xmlns:w16cid="http://schemas.microsoft.com/office/word/2016/wordml/cid" xmlns:w16="http://schemas.microsoft.com/office/word/2018/wordml" xmlns:w16du="http://schemas.microsoft.com/office/word/2023/wordml/word16du" xmlns:w16sdtdh="http://schemas.microsoft.com/office/word/2020/wordml/sdtdatahash" xmlns:w16sdtfl="http://schemas.microsoft.com/office/word/2024/wordml/sdtformatlock" xmlns:w16se="http://schemas.microsoft.com/office/word/2015/wordml/symex" xmlns:wpg="http://schemas.microsoft.com/office/word/2010/wordprocessingGroup" xmlns:wpi="http://schemas.microsoft.com/office/word/2010/wordprocessingInk" xmlns:wne="http://schemas.microsoft.com/office/word/2006/wordml" xmlns:wps="http://schemas.microsoft.com/office/word/2010/wordprocessingShape" mc:Ignorable="w14 w15 w16se w16cid w16 w16cex w16sdtdh w16sdtfl w16du wp14">
   <w:abstractNum w:abstractNumId="0" w15:restartNumberingAfterBreak="0">
     <w:nsid w:val="0EC83E66"/>
     <w:multiLevelType w:val="hybridMultilevel"/>

</xml_diff>